<commit_message>
Update report to the reproduced results; add report figure script
- run every experiment the report cites: frozen-circuit hybrid x 5 seeds,
  optimiser comparison, full-data runs, learning curve
- GNN results reproduce the report exactly; XGBoost depended on the CPU
  thread count, so it is now pinned to one thread and re-run
- baseline_xgboost saves feature importances (<tag>_importance.json)
- make_report_figures.py rebuilds report Figures 8-12 and report_numbers.json
- report: XGBoost numbers, feature-importance paragraph, Figures 8-12,
  Appendix B tables, structure table and run commands updated

Co-Authored-By: Claude Opus 5.5 (1M context) <noreply@anthropic.com>
</commit_message>
<xml_diff>
--- a/HyQCGNN_Final_Project_Report.docx
+++ b/HyQCGNN_Final_Project_Report.docx
@@ -77,19 +77,7 @@
         <w:rPr>
           <w:sz w:val="26"/>
         </w:rPr>
-        <w:t xml:space="preserve"> </w:t>
-      </w:r>
-      <w:r>
-        <w:rPr>
-          <w:sz w:val="26"/>
-        </w:rPr>
-        <w:t xml:space="preserve">—</w:t>
-      </w:r>
-      <w:r>
-        <w:rPr>
-          <w:sz w:val="26"/>
-        </w:rPr>
-        <w:t xml:space="preserve"> </w:t>
+        <w:t xml:space="preserve"> — </w:t>
       </w:r>
       <w:r>
         <w:rPr>
@@ -107,10 +95,7 @@
         <w:jc w:val="center"/>
       </w:pPr>
       <w:r>
-        <w:t xml:space="preserve">Submitted in partial fulfilment of the requirements for the course:</w:t>
-      </w:r>
-      <w:r>
-        <w:t xml:space="preserve"> </w:t>
+        <w:t xml:space="preserve">Submitted in partial fulfilment of the requirements for the course: </w:t>
       </w:r>
       <w:r>
         <w:rPr>
@@ -127,25 +112,7 @@
         <w:jc w:val="center"/>
       </w:pPr>
       <w:r>
-        <w:t xml:space="preserve">Base paper: M. Vitz, H. Mohammadbagherpoor, S. Sandeep, A. Vlasic, R. Padbury and A. Pham,</w:t>
-      </w:r>
-      <w:r>
-        <w:t xml:space="preserve"> </w:t>
-      </w:r>
-      <w:r>
-        <w:t xml:space="preserve">“</w:t>
-      </w:r>
-      <w:r>
-        <w:t xml:space="preserve">Hybrid Quantum Graph Neural Network for Molecular Property Prediction,</w:t>
-      </w:r>
-      <w:r>
-        <w:t xml:space="preserve">”</w:t>
-      </w:r>
-      <w:r>
-        <w:t xml:space="preserve"> </w:t>
-      </w:r>
-      <w:r>
-        <w:t xml:space="preserve">arXiv:2405.05205, 2024.</w:t>
+        <w:t xml:space="preserve">Base paper: M. Vitz, H. Mohammadbagherpoor, S. Sandeep, A. Vlasic, R. Padbury and A. Pham, “Hybrid Quantum Graph Neural Network for Molecular Property Prediction,” arXiv:2405.05205, 2024.</w:t>
       </w:r>
     </w:p>
     <w:p>
@@ -155,10 +122,7 @@
         <w:jc w:val="center"/>
       </w:pPr>
       <w:r>
-        <w:t xml:space="preserve">Submitted by:</w:t>
-      </w:r>
-      <w:r>
-        <w:t xml:space="preserve"> </w:t>
+        <w:t xml:space="preserve">Submitted by: </w:t>
       </w:r>
       <w:r>
         <w:rPr>
@@ -232,10 +196,7 @@
         <w:t xml:space="preserve">Under the guidance of:</w:t>
       </w:r>
       <w:r>
-        <w:t xml:space="preserve"> </w:t>
-      </w:r>
-      <w:r>
-        <w:t xml:space="preserve">[Guide name], [Co-guide name] — Department of Computer Science and Engineering, Indian Institute of Information Technology Kottayam</w:t>
+        <w:t xml:space="preserve"> [Guide name], [Co-guide name] — Department of Computer Science and Engineering, Indian Institute of Information Technology Kottayam</w:t>
       </w:r>
     </w:p>
     <w:p>
@@ -279,7 +240,7 @@
         <w:pStyle w:val="BodyText"/>
       </w:pPr>
       <w:r>
-        <w:t xml:space="preserve">Over five random seeds, the hybrid reaches a test R² of 0.43 ± 0.20 (MAE 0.40 eV), ahead of the classical GNN at 0.29 ± 0.16 (MAE 0.48 eV) on 4 of 5 seeds, while XGBoost reaches 0.68 ± 0.09 (0.75 ± 0.09 when tuned) and wins on every seed. A frozen-circuit ablation shows that the hybrid’s advantage does not come from training the quantum parameters: with its 30 circuit angles fixed at random values it scores 0.41 ± 0.15. Measuring with 1,024 shots lowers the mean R² by less than 0.01. With all 2,652 ABO3 oxides, XGBoost reaches R² 0.96 and the classical GNN (0.57) overtakes the hybrid (0.55).</w:t>
+        <w:t xml:space="preserve">Over five random seeds, the hybrid reaches a test R² of 0.43 ± 0.20 (MAE 0.40 eV), ahead of the classical GNN at 0.29 ± 0.16 (MAE 0.48 eV) on 4 of 5 seeds, while XGBoost reaches 0.66 ± 0.12 (0.73 ± 0.14 when tuned) and wins on every seed. A frozen-circuit ablation shows that the hybrid’s advantage does not come from training the quantum parameters: with its 30 circuit angles fixed at random values it scores 0.41 ± 0.15. Measuring with 1,024 shots lowers the mean R² by less than 0.01. With all 2,652 ABO3 oxides, XGBoost reaches R² 0.96 and the classical GNN (0.57) overtakes the hybrid (0.55).</w:t>
       </w:r>
     </w:p>
     <w:p>
@@ -302,10 +263,7 @@
         <w:t xml:space="preserve">Keywords:</w:t>
       </w:r>
       <w:r>
-        <w:t xml:space="preserve"> </w:t>
-      </w:r>
-      <w:r>
-        <w:t xml:space="preserve">Quantum machine learning, hybrid quantum-classical neural network, graph neural network, GENConv, amplitude encoding, variational quantum circuit, gradient-free optimisation, Nevergrad, perovskites, formation energy, Qiskit.</w:t>
+        <w:t xml:space="preserve"> Quantum machine learning, hybrid quantum-classical neural network, graph neural network, GENConv, amplitude encoding, variational quantum circuit, gradient-free optimisation, Nevergrad, perovskites, formation energy, Qiskit.</w:t>
       </w:r>
     </w:p>
     <w:bookmarkEnd w:id="20"/>
@@ -1279,10 +1237,7 @@
         <w:pStyle w:val="FirstParagraph"/>
       </w:pPr>
       <w:r>
-        <w:t xml:space="preserve">Data-driven models now predict many materials properties close to DFT accuracy at a tiny fraction of the cost. Benchmarks such as MatBench [3] collect standard tasks so that models can be compared fairly. One of them,</w:t>
-      </w:r>
-      <w:r>
-        <w:t xml:space="preserve"> </w:t>
+        <w:t xml:space="preserve">Data-driven models now predict many materials properties close to DFT accuracy at a tiny fraction of the cost. Benchmarks such as MatBench [3] collect standard tasks so that models can be compared fairly. One of them, </w:t>
       </w:r>
       <w:r>
         <w:rPr>
@@ -1338,13 +1293,7 @@
         <w:t xml:space="preserve">Generalised aggregation.</w:t>
       </w:r>
       <w:r>
-        <w:t xml:space="preserve"> </w:t>
-      </w:r>
-      <w:r>
-        <w:t xml:space="preserve">Messages from neighbours are combined with a softmax whose inverse temperature</w:t>
-      </w:r>
-      <w:r>
-        <w:t xml:space="preserve"> </w:t>
+        <w:t xml:space="preserve"> Messages from neighbours are combined with a softmax whose inverse temperature </w:t>
       </w:r>
       <w:r>
         <w:rPr>
@@ -1354,13 +1303,7 @@
         <w:t xml:space="preserve">t</w:t>
       </w:r>
       <w:r>
-        <w:t xml:space="preserve"> </w:t>
-      </w:r>
-      <w:r>
-        <w:t xml:space="preserve">is learned. A small</w:t>
-      </w:r>
-      <w:r>
-        <w:t xml:space="preserve"> </w:t>
+        <w:t xml:space="preserve"> is learned. A small </w:t>
       </w:r>
       <w:r>
         <w:rPr>
@@ -1370,13 +1313,7 @@
         <w:t xml:space="preserve">t</w:t>
       </w:r>
       <w:r>
-        <w:t xml:space="preserve"> </w:t>
-      </w:r>
-      <w:r>
-        <w:t xml:space="preserve">behaves like mean aggregation and a large</w:t>
-      </w:r>
-      <w:r>
-        <w:t xml:space="preserve"> </w:t>
+        <w:t xml:space="preserve"> behaves like mean aggregation and a large </w:t>
       </w:r>
       <w:r>
         <w:rPr>
@@ -1386,10 +1323,7 @@
         <w:t xml:space="preserve">t</w:t>
       </w:r>
       <w:r>
-        <w:t xml:space="preserve"> </w:t>
-      </w:r>
-      <w:r>
-        <w:t xml:space="preserve">like max aggregation, so the model chooses its own pooling.</w:t>
+        <w:t xml:space="preserve"> like max aggregation, so the model chooses its own pooling.</w:t>
       </w:r>
     </w:p>
     <w:p>
@@ -1408,13 +1342,7 @@
         <w:t xml:space="preserve">Message normalisation.</w:t>
       </w:r>
       <w:r>
-        <w:t xml:space="preserve"> </w:t>
-      </w:r>
-      <w:r>
-        <w:t xml:space="preserve">The aggregated message is normalised and rescaled by a learnable factor</w:t>
-      </w:r>
-      <w:r>
-        <w:t xml:space="preserve"> </w:t>
+        <w:t xml:space="preserve"> The aggregated message is normalised and rescaled by a learnable factor </w:t>
       </w:r>
       <w:r>
         <w:rPr>
@@ -1424,10 +1352,7 @@
         <w:t xml:space="preserve">s</w:t>
       </w:r>
       <w:r>
-        <w:t xml:space="preserve"> </w:t>
-      </w:r>
-      <w:r>
-        <w:t xml:space="preserve">before it is added to the node’s own features, which stabilises training and lets edge features enter the update.</w:t>
+        <w:t xml:space="preserve"> before it is added to the node’s own features, which stabilises training and lets edge features enter the update.</w:t>
       </w:r>
     </w:p>
     <w:bookmarkEnd w:id="29"/>
@@ -1473,25 +1398,7 @@
         <w:pStyle w:val="FirstParagraph"/>
       </w:pPr>
       <w:r>
-        <w:t xml:space="preserve">Gradient-free (black-box) optimisers only need the value of the loss for a proposed parameter vector. Nevergrad [5] is an open-source library of such methods. Its default, NGOpt, is an</w:t>
-      </w:r>
-      <w:r>
-        <w:t xml:space="preserve"> </w:t>
-      </w:r>
-      <w:r>
-        <w:t xml:space="preserve">“</w:t>
-      </w:r>
-      <w:r>
-        <w:t xml:space="preserve">algorithm-selection wizard</w:t>
-      </w:r>
-      <w:r>
-        <w:t xml:space="preserve">”</w:t>
-      </w:r>
-      <w:r>
-        <w:t xml:space="preserve"> </w:t>
-      </w:r>
-      <w:r>
-        <w:t xml:space="preserve">that picks and combines strategies (for example CMA-ES, differential evolution or (1+1) evolution strategies) according to the dimension and budget of the problem [6]. Black-box methods scale poorly to millions of weights, but the models here have only about 120 parameters, which is well within their range.</w:t>
+        <w:t xml:space="preserve">Gradient-free (black-box) optimisers only need the value of the loss for a proposed parameter vector. Nevergrad [5] is an open-source library of such methods. Its default, NGOpt, is an “algorithm-selection wizard” that picks and combines strategies (for example CMA-ES, differential evolution or (1+1) evolution strategies) according to the dimension and budget of the problem [6]. Black-box methods scale poorly to millions of weights, but the models here have only about 120 parameters, which is well within their range.</w:t>
       </w:r>
     </w:p>
     <w:bookmarkEnd w:id="31"/>
@@ -1735,10 +1642,7 @@
         <w:t xml:space="preserve">One split, 25 test points.</w:t>
       </w:r>
       <w:r>
-        <w:t xml:space="preserve"> </w:t>
-      </w:r>
-      <w:r>
-        <w:t xml:space="preserve">With so few test crystals, R² can move by 0.1 or more between random splits. No error bars are reported.</w:t>
+        <w:t xml:space="preserve"> With so few test crystals, R² can move by 0.1 or more between random splits. No error bars are reported.</w:t>
       </w:r>
     </w:p>
     <w:p>
@@ -1757,10 +1661,7 @@
         <w:t xml:space="preserve">No ablation of the circuit.</w:t>
       </w:r>
       <w:r>
-        <w:t xml:space="preserve"> </w:t>
-      </w:r>
-      <w:r>
-        <w:t xml:space="preserve">It is not shown whether training the 30 circuit angles helps, or whether the GENConv layer does all the work.</w:t>
+        <w:t xml:space="preserve"> It is not shown whether training the 30 circuit angles helps, or whether the GENConv layer does all the work.</w:t>
       </w:r>
     </w:p>
     <w:p>
@@ -1779,10 +1680,7 @@
         <w:t xml:space="preserve">Unclear evaluation set for XGBoost.</w:t>
       </w:r>
       <w:r>
-        <w:t xml:space="preserve"> </w:t>
-      </w:r>
-      <w:r>
-        <w:t xml:space="preserve">The paper’s XGBoost parity plot shows far more than 25 points, so it may not be scored on the same 25 test crystals as the GNNs.</w:t>
+        <w:t xml:space="preserve"> The paper’s XGBoost parity plot shows far more than 25 points, so it may not be scored on the same 25 test crystals as the GNNs.</w:t>
       </w:r>
     </w:p>
     <w:p>
@@ -1801,10 +1699,7 @@
         <w:t xml:space="preserve">Unspecified details.</w:t>
       </w:r>
       <w:r>
-        <w:t xml:space="preserve"> </w:t>
-      </w:r>
-      <w:r>
-        <w:t xml:space="preserve">Node ordering, how GENConv output becomes a 5×5 matrix, how 25 values fill 32 amplitudes and how ⟨Z⟩ values become an energy are not described, and no code is released.</w:t>
+        <w:t xml:space="preserve"> Node ordering, how GENConv output becomes a 5×5 matrix, how 25 values fill 32 amplitudes and how ⟨Z⟩ values become an energy are not described, and no code is released.</w:t>
       </w:r>
     </w:p>
     <w:p>
@@ -1872,10 +1767,7 @@
         <w:t xml:space="preserve">Faithful hybrid architecture.</w:t>
       </w:r>
       <w:r>
-        <w:t xml:space="preserve"> </w:t>
-      </w:r>
-      <w:r>
-        <w:t xml:space="preserve">GENConv with learnable softmax temperature and message scaling, a 5×5 graph reduction, amplitude encoding on 5 qubits, an RX–RY–RZZ-ring ansatz and a trainable RX–RY–RZ read-out, as in the paper’s Figure 2.</w:t>
+        <w:t xml:space="preserve"> GENConv with learnable softmax temperature and message scaling, a 5×5 graph reduction, amplitude encoding on 5 qubits, an RX–RY–RZZ-ring ansatz and a trainable RX–RY–RZ read-out, as in the paper’s Figure 2.</w:t>
       </w:r>
     </w:p>
     <w:p>
@@ -1894,10 +1786,7 @@
         <w:t xml:space="preserve">Fully gradient-free training</w:t>
       </w:r>
       <w:r>
-        <w:t xml:space="preserve"> </w:t>
-      </w:r>
-      <w:r>
-        <w:t xml:space="preserve">with Nevergrad NGOpt for both GNNs, with validation-based model selection and a single, final test evaluation.</w:t>
+        <w:t xml:space="preserve"> with Nevergrad NGOpt for both GNNs, with validation-based model selection and a single, final test evaluation.</w:t>
       </w:r>
     </w:p>
     <w:p>
@@ -1916,10 +1805,7 @@
         <w:t xml:space="preserve">Fast, verified quantum simulation.</w:t>
       </w:r>
       <w:r>
-        <w:t xml:space="preserve"> </w:t>
-      </w:r>
-      <w:r>
-        <w:t xml:space="preserve">The input-independent part of the circuit is turned into one 32×32 unitary per parameter set and applied to all crystals with a single matrix product. A unit test checks that this equals the full Qiskit circuit.</w:t>
+        <w:t xml:space="preserve"> The input-independent part of the circuit is turned into one 32×32 unitary per parameter set and applied to all crystals with a single matrix product. A unit test checks that this equals the full Qiskit circuit.</w:t>
       </w:r>
     </w:p>
     <w:p>
@@ -1938,10 +1824,7 @@
         <w:t xml:space="preserve">Multi-seed evaluation.</w:t>
       </w:r>
       <w:r>
-        <w:t xml:space="preserve"> </w:t>
-      </w:r>
-      <w:r>
-        <w:t xml:space="preserve">Every main result is repeated over five seeds (42, 1, 2, 3, 4), each giving a new split, initialisation and optimiser run, and is reported as mean ± standard deviation.</w:t>
+        <w:t xml:space="preserve"> Every main result is repeated over five seeds (42, 1, 2, 3, 4), each giving a new split, initialisation and optimiser run, and is reported as mean ± standard deviation.</w:t>
       </w:r>
     </w:p>
     <w:p>
@@ -1960,10 +1843,7 @@
         <w:t xml:space="preserve">Frozen-circuit ablation.</w:t>
       </w:r>
       <w:r>
-        <w:t xml:space="preserve"> </w:t>
-      </w:r>
-      <w:r>
-        <w:t xml:space="preserve">The hybrid is retrained with the 30 circuit angles fixed at random values, which isolates what training the quantum layer adds.</w:t>
+        <w:t xml:space="preserve"> The hybrid is retrained with the 30 circuit angles fixed at random values, which isolates what training the quantum layer adds.</w:t>
       </w:r>
     </w:p>
     <w:p>
@@ -1982,10 +1862,7 @@
         <w:t xml:space="preserve">Shot-noise evaluation.</w:t>
       </w:r>
       <w:r>
-        <w:t xml:space="preserve"> </w:t>
-      </w:r>
-      <w:r>
-        <w:t xml:space="preserve">The trained hybrid is also scored with 1,024 measurement shots per circuit, as on a real device.</w:t>
+        <w:t xml:space="preserve"> The trained hybrid is also scored with 1,024 measurement shots per circuit, as on a real device.</w:t>
       </w:r>
     </w:p>
     <w:p>
@@ -2004,10 +1881,7 @@
         <w:t xml:space="preserve">Further ablations.</w:t>
       </w:r>
       <w:r>
-        <w:t xml:space="preserve"> </w:t>
-      </w:r>
-      <w:r>
-        <w:t xml:space="preserve">Five optimisers, a reduced feature set (the paper’s Figure 4 features), longer training (10,000 iterations), a tuned XGBoost and the full 2,652-crystal data set.</w:t>
+        <w:t xml:space="preserve"> Five optimisers, a reduced feature set (the paper’s Figure 4 features), longer training (10,000 iterations), a tuned XGBoost and the full 2,652-crystal data set.</w:t>
       </w:r>
     </w:p>
     <w:p>
@@ -2026,10 +1900,7 @@
         <w:t xml:space="preserve">Robust featurisation.</w:t>
       </w:r>
       <w:r>
-        <w:t xml:space="preserve"> </w:t>
-      </w:r>
-      <w:r>
-        <w:t xml:space="preserve">A fallback for oxidation states when pymatgen cannot charge-balance a hypothetical compound, which otherwise silently zeroes the Ewald energies and ionic radii for about a third of the crystals.</w:t>
+        <w:t xml:space="preserve"> A fallback for oxidation states when pymatgen cannot charge-balance a hypothetical compound, which otherwise silently zeroes the Ewald energies and ionic radii for about a third of the crystals.</w:t>
       </w:r>
     </w:p>
     <w:bookmarkEnd w:id="36"/>
@@ -2161,10 +2032,7 @@
         <w:pStyle w:val="FirstParagraph"/>
       </w:pPr>
       <w:r>
-        <w:t xml:space="preserve">The data come from</w:t>
-      </w:r>
-      <w:r>
-        <w:t xml:space="preserve"> </w:t>
+        <w:t xml:space="preserve">The data come from </w:t>
       </w:r>
       <w:r>
         <w:rPr>
@@ -2174,10 +2042,7 @@
         <w:t xml:space="preserve">matbench_perovskites</w:t>
       </w:r>
       <w:r>
-        <w:t xml:space="preserve"> </w:t>
-      </w:r>
-      <w:r>
-        <w:t xml:space="preserve">[3], which packages the Castelli perovskite data set [2]: 18,928 five-atom cubic perovskite cells with DFT formation energies in eV per cell. Following the paper, only oxides with formula ABO3 are kept (one A cation, one B cation, three oxygens), which leaves 2,652 structures. A seeded random sample of 246 of them (seed 42) forms the paper-sized data set.</w:t>
+        <w:t xml:space="preserve"> [3], which packages the Castelli perovskite data set [2]: 18,928 five-atom cubic perovskite cells with DFT formation energies in eV per cell. Following the paper, only oxides with formula ABO3 are kept (one A cation, one B cation, three oxygens), which leaves 2,652 structures. A seeded random sample of 246 of them (seed 42) forms the paper-sized data set.</w:t>
       </w:r>
     </w:p>
     <w:p>
@@ -2185,10 +2050,7 @@
         <w:pStyle w:val="BodyText"/>
       </w:pPr>
       <w:r>
-        <w:t xml:space="preserve">The task is regression. Given the crystal structure</w:t>
-      </w:r>
-      <w:r>
-        <w:t xml:space="preserve"> </w:t>
+        <w:t xml:space="preserve">The task is regression. Given the crystal structure </w:t>
       </w:r>
       <w:r>
         <w:rPr>
@@ -2198,10 +2060,7 @@
         <w:t xml:space="preserve">S</w:t>
       </w:r>
       <w:r>
-        <w:t xml:space="preserve">, predict its formation energy</w:t>
-      </w:r>
-      <w:r>
-        <w:t xml:space="preserve"> </w:t>
+        <w:t xml:space="preserve">, predict its formation energy </w:t>
       </w:r>
       <w:r>
         <w:rPr>
@@ -2287,25 +2146,7 @@
         <w:pStyle w:val="FirstParagraph"/>
       </w:pPr>
       <w:r>
-        <w:t xml:space="preserve">Every ABO3 primitive cell has exactly five atoms, so every crystal becomes a fully connected graph with 5 nodes and 20 directed edges. The node order is fixed to [A, B, O, O, O]. The A site (12-fold cage) and B site (octahedral) are taken from the data set’s own site order, which was checked against the geometry of every undistorted cell. A fixed order is what makes</w:t>
-      </w:r>
-      <w:r>
-        <w:t xml:space="preserve"> </w:t>
-      </w:r>
-      <w:r>
-        <w:t xml:space="preserve">“</w:t>
-      </w:r>
-      <w:r>
-        <w:t xml:space="preserve">atom 0</w:t>
-      </w:r>
-      <w:r>
-        <w:t xml:space="preserve">”</w:t>
-      </w:r>
-      <w:r>
-        <w:t xml:space="preserve"> </w:t>
-      </w:r>
-      <w:r>
-        <w:t xml:space="preserve">mean the A cation in every crystal, which both the 5×5 matrix and the XGBoost table rely on.</w:t>
+        <w:t xml:space="preserve">Every ABO3 primitive cell has exactly five atoms, so every crystal becomes a fully connected graph with 5 nodes and 20 directed edges. The node order is fixed to [A, B, O, O, O]. The A site (12-fold cage) and B site (octahedral) are taken from the data set’s own site order, which was checked against the geometry of every undistorted cell. A fixed order is what makes “atom 0” mean the A cation in every crystal, which both the 5×5 matrix and the XGBoost table rely on.</w:t>
       </w:r>
     </w:p>
     <w:p>
@@ -3050,10 +2891,7 @@
         <w:t xml:space="preserve">Oxidation-state fallback.</w:t>
       </w:r>
       <w:r>
-        <w:t xml:space="preserve"> </w:t>
-      </w:r>
-      <w:r>
-        <w:t xml:space="preserve">Ewald energies and ionic radii need oxidation states. pymatgen’s charge-balanced guess fails for 76 of the 246 sampled crystals, because many Castelli compounds are hypothetical (for example CaScO3 cannot reach +6 on its cations). Without a fix, every state silently stays at 0, which zeroes the Ewald energies and radii for those crystals. The implementation fixes O at −2 and picks the pair of known cation states whose sum is closest to +6, preferring common states. 30 of the 76 then balance exactly; the remaining 46 keep the closest possible charge.</w:t>
+        <w:t xml:space="preserve"> Ewald energies and ionic radii need oxidation states. pymatgen’s charge-balanced guess fails for 76 of the 246 sampled crystals, because many Castelli compounds are hypothetical (for example CaScO3 cannot reach +6 on its cations). Without a fix, every state silently stays at 0, which zeroes the Ewald energies and radii for those crystals. The implementation fixes O at −2 and picks the pair of known cation states whose sum is closest to +6, preferring common states. 30 of the 76 then balance exactly; the remaining 46 keep the closest possible charge.</w:t>
       </w:r>
     </w:p>
     <w:p>
@@ -3080,10 +2918,7 @@
         <w:pStyle w:val="FirstParagraph"/>
       </w:pPr>
       <w:r>
-        <w:t xml:space="preserve">One GENConv layer [4] maps the 7 node features to a hidden width of 4. For a node</w:t>
-      </w:r>
-      <w:r>
-        <w:t xml:space="preserve"> </w:t>
+        <w:t xml:space="preserve">One GENConv layer [4] maps the 7 node features to a hidden width of 4. For a node </w:t>
       </w:r>
       <w:r>
         <w:rPr>
@@ -3093,13 +2928,7 @@
         <w:t xml:space="preserve">v</w:t>
       </w:r>
       <w:r>
-        <w:t xml:space="preserve"> </w:t>
-      </w:r>
-      <w:r>
-        <w:t xml:space="preserve">with neighbours</w:t>
-      </w:r>
-      <w:r>
-        <w:t xml:space="preserve"> </w:t>
+        <w:t xml:space="preserve"> with neighbours </w:t>
       </w:r>
       <w:r>
         <w:rPr>
@@ -3109,10 +2938,7 @@
         <w:t xml:space="preserve">u</w:t>
       </w:r>
       <w:r>
-        <w:t xml:space="preserve">, the message from</w:t>
-      </w:r>
-      <w:r>
-        <w:t xml:space="preserve"> </w:t>
+        <w:t xml:space="preserve">, the message from </w:t>
       </w:r>
       <w:r>
         <w:rPr>
@@ -3122,10 +2948,7 @@
         <w:t xml:space="preserve">u</w:t>
       </w:r>
       <w:r>
-        <w:t xml:space="preserve"> </w:t>
-      </w:r>
-      <w:r>
-        <w:t xml:space="preserve">includes the edge features, messages are combined with a learnable-temperature softmax, normalised, and added back:</w:t>
+        <w:t xml:space="preserve"> includes the edge features, messages are combined with a learnable-temperature softmax, normalised, and added back:</w:t>
       </w:r>
     </w:p>
     <w:p>
@@ -3231,10 +3054,7 @@
         <w:pStyle w:val="BodyText"/>
       </w:pPr>
       <w:r>
-        <w:t xml:space="preserve">Here</w:t>
-      </w:r>
-      <w:r>
-        <w:t xml:space="preserve"> </w:t>
+        <w:t xml:space="preserve">Here </w:t>
       </w:r>
       <w:r>
         <w:rPr>
@@ -3244,13 +3064,7 @@
         <w:t xml:space="preserve">t</w:t>
       </w:r>
       <w:r>
-        <w:t xml:space="preserve"> </w:t>
-      </w:r>
-      <w:r>
-        <w:t xml:space="preserve">(inverse temperature) and</w:t>
-      </w:r>
-      <w:r>
-        <w:t xml:space="preserve"> </w:t>
+        <w:t xml:space="preserve"> (inverse temperature) and </w:t>
       </w:r>
       <w:r>
         <w:rPr>
@@ -3260,10 +3074,7 @@
         <w:t xml:space="preserve">s</w:t>
       </w:r>
       <w:r>
-        <w:t xml:space="preserve"> </w:t>
-      </w:r>
-      <w:r>
-        <w:t xml:space="preserve">(message scale) are learned. The MLP is a single linear layer, as in the paper’s footnote.</w:t>
+        <w:t xml:space="preserve"> (message scale) are learned. The MLP is a single linear layer, as in the paper’s footnote.</w:t>
       </w:r>
     </w:p>
     <w:p>
@@ -3271,25 +3082,7 @@
         <w:pStyle w:val="BodyText"/>
       </w:pPr>
       <w:r>
-        <w:t xml:space="preserve">The paper says GENConv produces</w:t>
-      </w:r>
-      <w:r>
-        <w:t xml:space="preserve"> </w:t>
-      </w:r>
-      <w:r>
-        <w:t xml:space="preserve">“</w:t>
-      </w:r>
-      <w:r>
-        <w:t xml:space="preserve">an intermediate graph with one node feature and one edge feature</w:t>
-      </w:r>
-      <w:r>
-        <w:t xml:space="preserve">”</w:t>
-      </w:r>
-      <w:r>
-        <w:t xml:space="preserve"> </w:t>
-      </w:r>
-      <w:r>
-        <w:t xml:space="preserve">that is represented as a symmetric weight matrix, but does not say how. This implementation uses two small heads:</w:t>
+        <w:t xml:space="preserve">The paper says GENConv produces “an intermediate graph with one node feature and one edge feature” that is represented as a symmetric weight matrix, but does not say how. This implementation uses two small heads:</w:t>
       </w:r>
     </w:p>
     <w:p>
@@ -3301,10 +3094,7 @@
         <w:pStyle w:val="Compact"/>
       </w:pPr>
       <w:r>
-        <w:t xml:space="preserve">a</w:t>
-      </w:r>
-      <w:r>
-        <w:t xml:space="preserve"> </w:t>
+        <w:t xml:space="preserve">a </w:t>
       </w:r>
       <w:r>
         <w:rPr>
@@ -3314,10 +3104,7 @@
         <w:t xml:space="preserve">node head</w:t>
       </w:r>
       <w:r>
-        <w:t xml:space="preserve"> </w:t>
-      </w:r>
-      <w:r>
-        <w:t xml:space="preserve">(linear 4 → 1) gives one scalar per atom, placed on the diagonal;</w:t>
+        <w:t xml:space="preserve"> (linear 4 → 1) gives one scalar per atom, placed on the diagonal;</w:t>
       </w:r>
     </w:p>
     <w:p>
@@ -3329,10 +3116,7 @@
         <w:pStyle w:val="Compact"/>
       </w:pPr>
       <w:r>
-        <w:t xml:space="preserve">an</w:t>
-      </w:r>
-      <w:r>
-        <w:t xml:space="preserve"> </w:t>
+        <w:t xml:space="preserve">an </w:t>
       </w:r>
       <w:r>
         <w:rPr>
@@ -3342,10 +3126,7 @@
         <w:t xml:space="preserve">edge head</w:t>
       </w:r>
       <w:r>
-        <w:t xml:space="preserve"> </w:t>
-      </w:r>
-      <w:r>
-        <w:t xml:space="preserve">(linear on [h_u, h_v, e_uv], 12 → 1) gives one scalar per edge, placed off the diagonal.</w:t>
+        <w:t xml:space="preserve"> (linear on [h_u, h_v, e_uv], 12 → 1) gives one scalar per edge, placed off the diagonal.</w:t>
       </w:r>
     </w:p>
     <w:p>
@@ -3451,10 +3232,7 @@
         <w:t xml:space="preserve">1. Amplitude encoding.</w:t>
       </w:r>
       <w:r>
-        <w:t xml:space="preserve"> </w:t>
-      </w:r>
-      <w:r>
-        <w:t xml:space="preserve">The 25 numbers are zero-padded to 32 = 2^5 and normalised, then written into the amplitudes of a 5-qubit state:</w:t>
+        <w:t xml:space="preserve"> The 25 numbers are zero-padded to 32 = 2^5 and normalised, then written into the amplitudes of a 5-qubit state:</w:t>
       </w:r>
     </w:p>
     <w:p>
@@ -3518,10 +3296,7 @@
         <w:t xml:space="preserve">2. Trainable ansatz.</w:t>
       </w:r>
       <w:r>
-        <w:t xml:space="preserve"> </w:t>
-      </w:r>
-      <w:r>
-        <w:t xml:space="preserve">An RX(θ_q) and RY(φ_q) rotation on every qubit, followed by a ring of entangling RZZ(η_q) gates on the pairs (0,1), (1,2), (2,3), (3,4) and (4,0).</w:t>
+        <w:t xml:space="preserve"> An RX(θ_q) and RY(φ_q) rotation on every qubit, followed by a ring of entangling RZZ(η_q) gates on the pairs (0,1), (1,2), (2,3), (3,4) and (4,0).</w:t>
       </w:r>
     </w:p>
     <w:p>
@@ -3536,10 +3311,7 @@
         <w:t xml:space="preserve">3. Trainable read-out.</w:t>
       </w:r>
       <w:r>
-        <w:t xml:space="preserve"> </w:t>
-      </w:r>
-      <w:r>
-        <w:t xml:space="preserve">RX(α_q), RY(β_q) and RZ(λ_q) on every qubit. Because these rotations come just before measurement, they let the model choose which observable it effectively measures.</w:t>
+        <w:t xml:space="preserve"> RX(α_q), RY(β_q) and RZ(λ_q) on every qubit. Because these rotations come just before measurement, they let the model choose which observable it effectively measures.</w:t>
       </w:r>
     </w:p>
     <w:p>
@@ -3554,10 +3326,7 @@
         <w:t xml:space="preserve">4. Measurement.</w:t>
       </w:r>
       <w:r>
-        <w:t xml:space="preserve"> </w:t>
-      </w:r>
-      <w:r>
-        <w:t xml:space="preserve">The expectation value ⟨Z_q⟩ of each qubit, computed from the outcome probabilities p(b) of the 32 basis states:</w:t>
+        <w:t xml:space="preserve"> The expectation value ⟨Z_q⟩ of each qubit, computed from the outcome probabilities p(b) of the 32 basis states:</w:t>
       </w:r>
     </w:p>
     <w:p>
@@ -5463,10 +5232,7 @@
         <w:t xml:space="preserve">data/graphs.pt</w:t>
       </w:r>
       <w:r>
-        <w:t xml:space="preserve">,</w:t>
-      </w:r>
-      <w:r>
-        <w:t xml:space="preserve"> </w:t>
+        <w:t xml:space="preserve">, </w:t>
       </w:r>
       <w:r>
         <w:rPr>
@@ -5494,10 +5260,7 @@
         <w:pStyle w:val="FirstParagraph"/>
       </w:pPr>
       <w:r>
-        <w:t xml:space="preserve">The code is about 1,300 lines of Python split into single-purpose files. Every constant from the paper (split sizes, feature names, 2,000 iterations, shot counts, seeds) lives in</w:t>
-      </w:r>
-      <w:r>
-        <w:t xml:space="preserve"> </w:t>
+        <w:t xml:space="preserve">The code is about 1,300 lines of Python split into single-purpose files. Every constant from the paper (split sizes, feature names, 2,000 iterations, shot counts, seeds) lives in </w:t>
       </w:r>
       <w:r>
         <w:rPr>
@@ -5642,13 +5405,7 @@
               <w:rPr>
                 <w:sz w:val="19"/>
               </w:rPr>
-              <w:t xml:space="preserve">Downloads</w:t>
-            </w:r>
-            <w:r>
-              <w:rPr>
-                <w:sz w:val="19"/>
-              </w:rPr>
-              <w:t xml:space="preserve"> </w:t>
+              <w:t xml:space="preserve">Downloads </w:t>
             </w:r>
             <w:r>
               <w:rPr>
@@ -5675,13 +5432,7 @@
               <w:rPr>
                 <w:sz w:val="19"/>
               </w:rPr>
-              <w:t xml:space="preserve"> </w:t>
-            </w:r>
-            <w:r>
-              <w:rPr>
-                <w:sz w:val="19"/>
-              </w:rPr>
-              <w:t xml:space="preserve">keeps all 2,652)</w:t>
+              <w:t xml:space="preserve"> keeps all 2,652)</w:t>
             </w:r>
           </w:p>
         </w:tc>
@@ -6126,6 +5877,41 @@
                 <w:sz w:val="19"/>
               </w:rPr>
               <w:t xml:space="preserve">Checks the fast quantum layer against full Qiskit circuits</w:t>
+            </w:r>
+          </w:p>
+        </w:tc>
+      </w:tr>
+      <w:tr>
+        <w:tc>
+          <w:tcPr/>
+          <w:p>
+            <w:pPr>
+              <w:pStyle w:val="Compact"/>
+              <w:spacing w:after="40"/>
+              <w:jc w:val="left"/>
+            </w:pPr>
+            <w:r>
+              <w:rPr>
+                <w:rStyle w:val="VerbatimChar"/>
+                <w:sz w:val="19"/>
+              </w:rPr>
+              <w:t xml:space="preserve">make_report_figures.py</w:t>
+            </w:r>
+          </w:p>
+        </w:tc>
+        <w:tc>
+          <w:tcPr/>
+          <w:p>
+            <w:pPr>
+              <w:pStyle w:val="Compact"/>
+              <w:spacing w:after="40"/>
+              <w:jc w:val="left"/>
+            </w:pPr>
+            <w:r>
+              <w:rPr>
+                <w:sz w:val="19"/>
+              </w:rPr>
+              <w:t xml:space="preserve">Result figures and numbers of this report (Figures 8–12)</w:t>
             </w:r>
           </w:p>
         </w:tc>
@@ -6147,10 +5933,7 @@
         <w:pStyle w:val="FirstParagraph"/>
       </w:pPr>
       <w:r>
-        <w:t xml:space="preserve">All experiments are command-line runs of the scripts above; Appendix D lists the exact commands. Each run writes four files to</w:t>
-      </w:r>
-      <w:r>
-        <w:t xml:space="preserve"> </w:t>
+        <w:t xml:space="preserve">All experiments are command-line runs of the scripts above; Appendix D lists the exact commands. Each run writes four files to </w:t>
       </w:r>
       <w:r>
         <w:rPr>
@@ -6159,10 +5942,7 @@
         <w:t xml:space="preserve">results/</w:t>
       </w:r>
       <w:r>
-        <w:t xml:space="preserve">: a metrics JSON, the test predictions, the best parameter vector and the training and validation loss curves. The file name carries every non-default option (for example</w:t>
-      </w:r>
-      <w:r>
-        <w:t xml:space="preserve"> </w:t>
+        <w:t xml:space="preserve">: a metrics JSON, the test predictions, the best parameter vector and the training and validation loss curves. The file name carries every non-default option (for example </w:t>
       </w:r>
       <w:r>
         <w:rPr>
@@ -6206,10 +5986,7 @@
         <w:pStyle w:val="BodyText"/>
       </w:pPr>
       <w:r>
-        <w:t xml:space="preserve">The implementation avoids this. The trainable part of the circuit (ansatz and read-out) does not depend on the input, so for each candidate parameter vector its 32×32 unitary U is built once with Qiskit’s</w:t>
-      </w:r>
-      <w:r>
-        <w:t xml:space="preserve"> </w:t>
+        <w:t xml:space="preserve">The implementation avoids this. The trainable part of the circuit (ansatz and read-out) does not depend on the input, so for each candidate parameter vector its 32×32 unitary U is built once with Qiskit’s </w:t>
       </w:r>
       <w:r>
         <w:rPr>
@@ -6273,10 +6050,7 @@
         <w:t xml:space="preserve">Encoding is normalised:</w:t>
       </w:r>
       <w:r>
-        <w:t xml:space="preserve"> </w:t>
-      </w:r>
-      <w:r>
-        <w:t xml:space="preserve">amplitude vectors have unit norm and length 32.</w:t>
+        <w:t xml:space="preserve"> amplitude vectors have unit norm and length 32.</w:t>
       </w:r>
     </w:p>
     <w:p>
@@ -6295,13 +6069,7 @@
         <w:t xml:space="preserve">Fast path equals the full circuit:</w:t>
       </w:r>
       <w:r>
-        <w:t xml:space="preserve"> </w:t>
-      </w:r>
-      <w:r>
-        <w:t xml:space="preserve">for random inputs and angles, the batched ⟨Z_q⟩ values match a full Qiskit circuit (StatePreparation + ansatz + read-out) simulated with</w:t>
-      </w:r>
-      <w:r>
-        <w:t xml:space="preserve"> </w:t>
+        <w:t xml:space="preserve"> for random inputs and angles, the batched ⟨Z_q⟩ values match a full Qiskit circuit (StatePreparation + ansatz + read-out) simulated with </w:t>
       </w:r>
       <w:r>
         <w:rPr>
@@ -6329,10 +6097,7 @@
         <w:t xml:space="preserve">Unitary cache is correct:</w:t>
       </w:r>
       <w:r>
-        <w:t xml:space="preserve"> </w:t>
-      </w:r>
-      <w:r>
-        <w:t xml:space="preserve">the same angles return the cached unitary; new angles rebuild it.</w:t>
+        <w:t xml:space="preserve"> the same angles return the cached unitary; new angles rebuild it.</w:t>
       </w:r>
     </w:p>
     <w:p>
@@ -6351,10 +6116,7 @@
         <w:t xml:space="preserve">Outputs are physical:</w:t>
       </w:r>
       <w:r>
-        <w:t xml:space="preserve"> </w:t>
-      </w:r>
-      <w:r>
-        <w:t xml:space="preserve">every expectation value lies in [−1, 1].</w:t>
+        <w:t xml:space="preserve"> every expectation value lies in [−1, 1].</w:t>
       </w:r>
     </w:p>
     <w:p>
@@ -6382,25 +6144,7 @@
         <w:pStyle w:val="FirstParagraph"/>
       </w:pPr>
       <w:r>
-        <w:t xml:space="preserve">All numbers below come from re-running every model with the final code. Unless stated otherwise, R² means the paper’s metric (R² of the linear fit of true vs predicted energy),</w:t>
-      </w:r>
-      <w:r>
-        <w:t xml:space="preserve"> </w:t>
-      </w:r>
-      <w:r>
-        <w:t xml:space="preserve">“</w:t>
-      </w:r>
-      <w:r>
-        <w:t xml:space="preserve">mean ± std</w:t>
-      </w:r>
-      <w:r>
-        <w:t xml:space="preserve">”</w:t>
-      </w:r>
-      <w:r>
-        <w:t xml:space="preserve"> </w:t>
-      </w:r>
-      <w:r>
-        <w:t xml:space="preserve">is over the five seeds, and energies are in eV per 5-atom cell.</w:t>
+        <w:t xml:space="preserve">All numbers below come from re-running every model with the final code. Unless stated otherwise, R² means the paper’s metric (R² of the linear fit of true vs predicted energy), “mean ± std” is over the five seeds, and energies are in eV per 5-atom cell.</w:t>
       </w:r>
     </w:p>
     <w:bookmarkStart w:id="95" w:name="data-set"/>
@@ -6612,7 +6356,7 @@
       <w:r>
         <w:drawing>
           <wp:inline>
-            <wp:extent cx="5334000" cy="1866899"/>
+            <wp:extent cx="5334000" cy="1847607"/>
             <wp:effectExtent b="0" l="0" r="0" t="0"/>
             <wp:docPr descr="" title="" id="101" name="Picture"/>
             <a:graphic>
@@ -6633,7 +6377,7 @@
                   <pic:spPr bwMode="auto">
                     <a:xfrm>
                       <a:off x="0" y="0"/>
-                      <a:ext cx="5334000" cy="1866899"/>
+                      <a:ext cx="5334000" cy="1847607"/>
                     </a:xfrm>
                     <a:prstGeom prst="rect">
                       <a:avLst/>
@@ -6823,39 +6567,39 @@
               <w:rPr>
                 <w:sz w:val="19"/>
               </w:rPr>
-              <w:t xml:space="preserve">0.804</w:t>
-            </w:r>
-          </w:p>
-        </w:tc>
-        <w:tc>
-          <w:tcPr/>
-          <w:p>
-            <w:pPr>
-              <w:pStyle w:val="Compact"/>
-              <w:spacing w:after="40"/>
-              <w:jc w:val="left"/>
-            </w:pPr>
-            <w:r>
-              <w:rPr>
-                <w:sz w:val="19"/>
-              </w:rPr>
-              <w:t xml:space="preserve">0.797</w:t>
-            </w:r>
-          </w:p>
-        </w:tc>
-        <w:tc>
-          <w:tcPr/>
-          <w:p>
-            <w:pPr>
-              <w:pStyle w:val="Compact"/>
-              <w:spacing w:after="40"/>
-              <w:jc w:val="left"/>
-            </w:pPr>
-            <w:r>
-              <w:rPr>
-                <w:sz w:val="19"/>
-              </w:rPr>
-              <w:t xml:space="preserve">0.239</w:t>
+              <w:t xml:space="preserve">0.827</w:t>
+            </w:r>
+          </w:p>
+        </w:tc>
+        <w:tc>
+          <w:tcPr/>
+          <w:p>
+            <w:pPr>
+              <w:pStyle w:val="Compact"/>
+              <w:spacing w:after="40"/>
+              <w:jc w:val="left"/>
+            </w:pPr>
+            <w:r>
+              <w:rPr>
+                <w:sz w:val="19"/>
+              </w:rPr>
+              <w:t xml:space="preserve">0.816</w:t>
+            </w:r>
+          </w:p>
+        </w:tc>
+        <w:tc>
+          <w:tcPr/>
+          <w:p>
+            <w:pPr>
+              <w:pStyle w:val="Compact"/>
+              <w:spacing w:after="40"/>
+              <w:jc w:val="left"/>
+            </w:pPr>
+            <w:r>
+              <w:rPr>
+                <w:sz w:val="19"/>
+              </w:rPr>
+              <w:t xml:space="preserve">0.226</w:t>
             </w:r>
           </w:p>
         </w:tc>
@@ -6909,43 +6653,43 @@
               <w:rPr>
                 <w:sz w:val="19"/>
               </w:rPr>
-              <w:t xml:space="preserve">0.667</w:t>
-            </w:r>
-          </w:p>
-        </w:tc>
-        <w:tc>
-          <w:tcPr>
-            <w:shd w:val="clear" w:color="auto" w:fill="F3F4F6"/>
-          </w:tcPr>
-          <w:p>
-            <w:pPr>
-              <w:pStyle w:val="Compact"/>
-              <w:spacing w:after="40"/>
-              <w:jc w:val="left"/>
-            </w:pPr>
-            <w:r>
-              <w:rPr>
-                <w:sz w:val="19"/>
-              </w:rPr>
-              <w:t xml:space="preserve">0.665</w:t>
-            </w:r>
-          </w:p>
-        </w:tc>
-        <w:tc>
-          <w:tcPr>
-            <w:shd w:val="clear" w:color="auto" w:fill="F3F4F6"/>
-          </w:tcPr>
-          <w:p>
-            <w:pPr>
-              <w:pStyle w:val="Compact"/>
-              <w:spacing w:after="40"/>
-              <w:jc w:val="left"/>
-            </w:pPr>
-            <w:r>
-              <w:rPr>
-                <w:sz w:val="19"/>
-              </w:rPr>
-              <w:t xml:space="preserve">0.298</w:t>
+              <w:t xml:space="preserve">0.661</w:t>
+            </w:r>
+          </w:p>
+        </w:tc>
+        <w:tc>
+          <w:tcPr>
+            <w:shd w:val="clear" w:color="auto" w:fill="F3F4F6"/>
+          </w:tcPr>
+          <w:p>
+            <w:pPr>
+              <w:pStyle w:val="Compact"/>
+              <w:spacing w:after="40"/>
+              <w:jc w:val="left"/>
+            </w:pPr>
+            <w:r>
+              <w:rPr>
+                <w:sz w:val="19"/>
+              </w:rPr>
+              <w:t xml:space="preserve">0.657</w:t>
+            </w:r>
+          </w:p>
+        </w:tc>
+        <w:tc>
+          <w:tcPr>
+            <w:shd w:val="clear" w:color="auto" w:fill="F3F4F6"/>
+          </w:tcPr>
+          <w:p>
+            <w:pPr>
+              <w:pStyle w:val="Compact"/>
+              <w:spacing w:after="40"/>
+              <w:jc w:val="left"/>
+            </w:pPr>
+            <w:r>
+              <w:rPr>
+                <w:sz w:val="19"/>
+              </w:rPr>
+              <w:t xml:space="preserve">0.311</w:t>
             </w:r>
           </w:p>
         </w:tc>
@@ -7171,7 +6915,7 @@
       <w:r>
         <w:drawing>
           <wp:inline>
-            <wp:extent cx="5334000" cy="2230581"/>
+            <wp:extent cx="5334000" cy="2196931"/>
             <wp:effectExtent b="0" l="0" r="0" t="0"/>
             <wp:docPr descr="" title="" id="105" name="Picture"/>
             <a:graphic>
@@ -7192,7 +6936,7 @@
                   <pic:spPr bwMode="auto">
                     <a:xfrm>
                       <a:off x="0" y="0"/>
-                      <a:ext cx="5334000" cy="2230581"/>
+                      <a:ext cx="5334000" cy="2196931"/>
                     </a:xfrm>
                     <a:prstGeom prst="rect">
                       <a:avLst/>
@@ -7382,39 +7126,39 @@
               <w:rPr>
                 <w:sz w:val="19"/>
               </w:rPr>
-              <w:t xml:space="preserve">0.749 ± 0.094</w:t>
-            </w:r>
-          </w:p>
-        </w:tc>
-        <w:tc>
-          <w:tcPr/>
-          <w:p>
-            <w:pPr>
-              <w:pStyle w:val="Compact"/>
-              <w:spacing w:after="40"/>
-              <w:jc w:val="left"/>
-            </w:pPr>
-            <w:r>
-              <w:rPr>
-                <w:sz w:val="19"/>
-              </w:rPr>
-              <w:t xml:space="preserve">0.723 ± 0.091</w:t>
-            </w:r>
-          </w:p>
-        </w:tc>
-        <w:tc>
-          <w:tcPr/>
-          <w:p>
-            <w:pPr>
-              <w:pStyle w:val="Compact"/>
-              <w:spacing w:after="40"/>
-              <w:jc w:val="left"/>
-            </w:pPr>
-            <w:r>
-              <w:rPr>
-                <w:sz w:val="19"/>
-              </w:rPr>
-              <w:t xml:space="preserve">0.270 ± 0.044</w:t>
+              <w:t xml:space="preserve">0.730 ± 0.140</w:t>
+            </w:r>
+          </w:p>
+        </w:tc>
+        <w:tc>
+          <w:tcPr/>
+          <w:p>
+            <w:pPr>
+              <w:pStyle w:val="Compact"/>
+              <w:spacing w:after="40"/>
+              <w:jc w:val="left"/>
+            </w:pPr>
+            <w:r>
+              <w:rPr>
+                <w:sz w:val="19"/>
+              </w:rPr>
+              <w:t xml:space="preserve">0.701 ± 0.139</w:t>
+            </w:r>
+          </w:p>
+        </w:tc>
+        <w:tc>
+          <w:tcPr/>
+          <w:p>
+            <w:pPr>
+              <w:pStyle w:val="Compact"/>
+              <w:spacing w:after="40"/>
+              <w:jc w:val="left"/>
+            </w:pPr>
+            <w:r>
+              <w:rPr>
+                <w:sz w:val="19"/>
+              </w:rPr>
+              <w:t xml:space="preserve">0.278 ± 0.068</w:t>
             </w:r>
           </w:p>
         </w:tc>
@@ -7468,43 +7212,43 @@
               <w:rPr>
                 <w:sz w:val="19"/>
               </w:rPr>
-              <w:t xml:space="preserve">0.675 ± 0.090</w:t>
-            </w:r>
-          </w:p>
-        </w:tc>
-        <w:tc>
-          <w:tcPr>
-            <w:shd w:val="clear" w:color="auto" w:fill="F3F4F6"/>
-          </w:tcPr>
-          <w:p>
-            <w:pPr>
-              <w:pStyle w:val="Compact"/>
-              <w:spacing w:after="40"/>
-              <w:jc w:val="left"/>
-            </w:pPr>
-            <w:r>
-              <w:rPr>
-                <w:sz w:val="19"/>
-              </w:rPr>
-              <w:t xml:space="preserve">0.639 ± 0.075</w:t>
-            </w:r>
-          </w:p>
-        </w:tc>
-        <w:tc>
-          <w:tcPr>
-            <w:shd w:val="clear" w:color="auto" w:fill="F3F4F6"/>
-          </w:tcPr>
-          <w:p>
-            <w:pPr>
-              <w:pStyle w:val="Compact"/>
-              <w:spacing w:after="40"/>
-              <w:jc w:val="left"/>
-            </w:pPr>
-            <w:r>
-              <w:rPr>
-                <w:sz w:val="19"/>
-              </w:rPr>
-              <w:t xml:space="preserve">0.309 ± 0.037</w:t>
+              <w:t xml:space="preserve">0.664 ± 0.120</w:t>
+            </w:r>
+          </w:p>
+        </w:tc>
+        <w:tc>
+          <w:tcPr>
+            <w:shd w:val="clear" w:color="auto" w:fill="F3F4F6"/>
+          </w:tcPr>
+          <w:p>
+            <w:pPr>
+              <w:pStyle w:val="Compact"/>
+              <w:spacing w:after="40"/>
+              <w:jc w:val="left"/>
+            </w:pPr>
+            <w:r>
+              <w:rPr>
+                <w:sz w:val="19"/>
+              </w:rPr>
+              <w:t xml:space="preserve">0.631 ± 0.107</w:t>
+            </w:r>
+          </w:p>
+        </w:tc>
+        <w:tc>
+          <w:tcPr>
+            <w:shd w:val="clear" w:color="auto" w:fill="F3F4F6"/>
+          </w:tcPr>
+          <w:p>
+            <w:pPr>
+              <w:pStyle w:val="Compact"/>
+              <w:spacing w:after="40"/>
+              <w:jc w:val="left"/>
+            </w:pPr>
+            <w:r>
+              <w:rPr>
+                <w:sz w:val="19"/>
+              </w:rPr>
+              <w:t xml:space="preserve">0.313 ± 0.049</w:t>
             </w:r>
           </w:p>
         </w:tc>
@@ -7982,7 +7726,7 @@
         <w:t xml:space="preserve">XGBoost beats the hybrid on every seed</w:t>
       </w:r>
       <w:r>
-        <w:t xml:space="preserve">, by 0.02 to 0.55 in R². Tuning it adds another 0.07 on average.</w:t>
+        <w:t xml:space="preserve">, by 0.04 to 0.57 in R². Tuning it adds another 0.07 on average.</w:t>
       </w:r>
     </w:p>
     <w:p>
@@ -8020,10 +7764,7 @@
         <w:t xml:space="preserve">The spread is large.</w:t>
       </w:r>
       <w:r>
-        <w:t xml:space="preserve"> </w:t>
-      </w:r>
-      <w:r>
-        <w:t xml:space="preserve">The hybrid ranges from R² 0.12 (seed 3) to 0.75 (seed 4) and the classical GNN from 0.00 to 0.46. A single 25-crystal test split can therefore move a model’s score by more than the gap between models, so single-split comparisons, including the paper’s, should be read with caution.</w:t>
+        <w:t xml:space="preserve"> The hybrid ranges from R² 0.12 (seed 3) to 0.75 (seed 4) and the classical GNN from 0.00 to 0.46. A single 25-crystal test split can therefore move a model’s score by more than the gap between models, so single-split comparisons, including the paper’s, should be read with caution.</w:t>
       </w:r>
     </w:p>
     <w:p>
@@ -8066,10 +7807,7 @@
         <w:pStyle w:val="BodyText"/>
       </w:pPr>
       <w:r>
-        <w:t xml:space="preserve">The interpretation is that the hybrid’s advantage over the classical GNN comes from its</w:t>
-      </w:r>
-      <w:r>
-        <w:t xml:space="preserve"> </w:t>
+        <w:t xml:space="preserve">The interpretation is that the hybrid’s advantage over the classical GNN comes from its </w:t>
       </w:r>
       <w:r>
         <w:rPr>
@@ -8121,7 +7859,7 @@
       <w:r>
         <w:drawing>
           <wp:inline>
-            <wp:extent cx="5334000" cy="1764323"/>
+            <wp:extent cx="5334000" cy="1668626"/>
             <wp:effectExtent b="0" l="0" r="0" t="0"/>
             <wp:docPr descr="" title="" id="111" name="Picture"/>
             <a:graphic>
@@ -8142,7 +7880,7 @@
                   <pic:spPr bwMode="auto">
                     <a:xfrm>
                       <a:off x="0" y="0"/>
-                      <a:ext cx="5334000" cy="1764323"/>
+                      <a:ext cx="5334000" cy="1668626"/>
                     </a:xfrm>
                     <a:prstGeom prst="rect">
                       <a:avLst/>
@@ -8188,10 +7926,7 @@
         <w:t xml:space="preserve">Optimiser.</w:t>
       </w:r>
       <w:r>
-        <w:t xml:space="preserve"> </w:t>
-      </w:r>
-      <w:r>
-        <w:t xml:space="preserve">With the same 2,000-evaluation budget, CMA-ES (0.514), NGOpt (0.491), (1+1)-ES (0.491) and TwoPointsDE (0.480) give similar results; NGOpt and (1+1)-ES give identical scores. Only PSO is clearly worse (0.343). NGOpt is a sound default.</w:t>
+        <w:t xml:space="preserve"> With the same 2,000-evaluation budget, CMA-ES (0.514), NGOpt (0.491), (1+1)-ES (0.491) and TwoPointsDE (0.480) give similar results; NGOpt and (1+1)-ES give identical scores. Only PSO is clearly worse (0.343). NGOpt is a sound default.</w:t>
       </w:r>
     </w:p>
     <w:p>
@@ -8206,10 +7941,7 @@
         <w:t xml:space="preserve">Feature set.</w:t>
       </w:r>
       <w:r>
-        <w:t xml:space="preserve"> </w:t>
-      </w:r>
-      <w:r>
-        <w:t xml:space="preserve">The paper’s Figure 4 shows only ionisation energy, Ewald site energy and Coulomb potential, so a reduced set with just those three types was tested. Every model gets worse: XGBoost 0.667 → 0.525, classical 0.339 → 0.222, hybrid 0.491 → 0.236. The full 7 + 4 descriptor set is needed.</w:t>
+        <w:t xml:space="preserve"> The paper’s Figure 4 shows only ionisation energy, Ewald site energy and Coulomb potential, so a reduced set with just those three types was tested. Every model gets worse: XGBoost 0.661 → 0.503, classical 0.339 → 0.222, hybrid 0.491 → 0.236. The full 7 + 4 descriptor set is needed.</w:t>
       </w:r>
     </w:p>
     <w:p>
@@ -8224,10 +7956,7 @@
         <w:t xml:space="preserve">Data size.</w:t>
       </w:r>
       <w:r>
-        <w:t xml:space="preserve"> </w:t>
-      </w:r>
-      <w:r>
-        <w:t xml:space="preserve">Training on the full data set (2,122 training and 265 test crystals, 80/10/10 split) raises every model, but not equally:</w:t>
+        <w:t xml:space="preserve"> Training on the full data set (2,122 training and 265 test crystals, 80/10/10 split) raises every model, but not equally:</w:t>
       </w:r>
     </w:p>
     <w:tbl>
@@ -8365,39 +8094,39 @@
               <w:rPr>
                 <w:sz w:val="19"/>
               </w:rPr>
-              <w:t xml:space="preserve">0.667</w:t>
-            </w:r>
-          </w:p>
-        </w:tc>
-        <w:tc>
-          <w:tcPr/>
-          <w:p>
-            <w:pPr>
-              <w:pStyle w:val="Compact"/>
-              <w:spacing w:after="40"/>
-              <w:jc w:val="left"/>
-            </w:pPr>
-            <w:r>
-              <w:rPr>
-                <w:sz w:val="19"/>
-              </w:rPr>
-              <w:t xml:space="preserve">0.961</w:t>
-            </w:r>
-          </w:p>
-        </w:tc>
-        <w:tc>
-          <w:tcPr/>
-          <w:p>
-            <w:pPr>
-              <w:pStyle w:val="Compact"/>
-              <w:spacing w:after="40"/>
-              <w:jc w:val="left"/>
-            </w:pPr>
-            <w:r>
-              <w:rPr>
-                <w:sz w:val="19"/>
-              </w:rPr>
-              <w:t xml:space="preserve">0.094</w:t>
+              <w:t xml:space="preserve">0.661</w:t>
+            </w:r>
+          </w:p>
+        </w:tc>
+        <w:tc>
+          <w:tcPr/>
+          <w:p>
+            <w:pPr>
+              <w:pStyle w:val="Compact"/>
+              <w:spacing w:after="40"/>
+              <w:jc w:val="left"/>
+            </w:pPr>
+            <w:r>
+              <w:rPr>
+                <w:sz w:val="19"/>
+              </w:rPr>
+              <w:t xml:space="preserve">0.965</w:t>
+            </w:r>
+          </w:p>
+        </w:tc>
+        <w:tc>
+          <w:tcPr/>
+          <w:p>
+            <w:pPr>
+              <w:pStyle w:val="Compact"/>
+              <w:spacing w:after="40"/>
+              <w:jc w:val="left"/>
+            </w:pPr>
+            <w:r>
+              <w:rPr>
+                <w:sz w:val="19"/>
+              </w:rPr>
+              <w:t xml:space="preserve">0.090</w:t>
             </w:r>
           </w:p>
         </w:tc>
@@ -8560,7 +8289,7 @@
       <w:r>
         <w:drawing>
           <wp:inline>
-            <wp:extent cx="5334000" cy="2240280"/>
+            <wp:extent cx="5334000" cy="2203603"/>
             <wp:effectExtent b="0" l="0" r="0" t="0"/>
             <wp:docPr descr="" title="" id="114" name="Picture"/>
             <a:graphic>
@@ -8581,7 +8310,7 @@
                   <pic:spPr bwMode="auto">
                     <a:xfrm>
                       <a:off x="0" y="0"/>
-                      <a:ext cx="5334000" cy="2240280"/>
+                      <a:ext cx="5334000" cy="2203603"/>
                     </a:xfrm>
                     <a:prstGeom prst="rect">
                       <a:avLst/>
@@ -8620,7 +8349,7 @@
         <w:pStyle w:val="BodyText"/>
       </w:pPr>
       <w:r>
-        <w:t xml:space="preserve">The learning curve makes the data effect explicit: XGBoost rises from 0.72 ± 0.04 with 196 training crystals to 0.83 with 400, 0.91 with 800 and 0.96 with 2,152. The paper’s XGBoost value of 0.861 sits between 400 and 800 training crystals on this curve.</w:t>
+        <w:t xml:space="preserve">The learning curve makes the data effect explicit: XGBoost rises from 0.72 ± 0.03 with 196 training crystals to 0.84 with 400, 0.91 with 800 and 0.96 with 2,152. The paper’s XGBoost value of 0.861 sits between 400 and 800 training crystals on this curve.</w:t>
       </w:r>
     </w:p>
     <w:bookmarkEnd w:id="116"/>
@@ -8643,7 +8372,7 @@
       <w:r>
         <w:drawing>
           <wp:inline>
-            <wp:extent cx="5334000" cy="2133600"/>
+            <wp:extent cx="5334000" cy="2131823"/>
             <wp:effectExtent b="0" l="0" r="0" t="0"/>
             <wp:docPr descr="" title="" id="118" name="Picture"/>
             <a:graphic>
@@ -8664,7 +8393,7 @@
                   <pic:spPr bwMode="auto">
                     <a:xfrm>
                       <a:off x="0" y="0"/>
-                      <a:ext cx="5334000" cy="2133600"/>
+                      <a:ext cx="5334000" cy="2131823"/>
                     </a:xfrm>
                     <a:prstGeom prst="rect">
                       <a:avLst/>
@@ -8703,7 +8432,7 @@
         <w:pStyle w:val="BodyText"/>
       </w:pPr>
       <w:r>
-        <w:t xml:space="preserve">The most important single features are the B-site cationic radius (0.143), the B-site Ewald site energy (0.095), the A-site cationic radius (0.071) and the B-site electronegativity (0.069). By type, cationic radius carries 21% of the total importance, followed by inverse distance, Ewald energy and Coulomb potential (14% each).</w:t>
+        <w:t xml:space="preserve">The most important single features are the B-site cationic radius (0.126), the B-site Ewald site energy (0.101), the B–O electronegativity difference (0.090) and the A-site cationic radius (0.065). By type, cationic radius carries 19% of the total importance, followed by electronegativity difference (17%), Ewald energy (14%) and inverse distance (13%).</w:t>
       </w:r>
     </w:p>
     <w:p>
@@ -8719,7 +8448,7 @@
         <w:pStyle w:val="BodyText"/>
       </w:pPr>
       <w:r>
-        <w:t xml:space="preserve">The paper’s top feature, the A-site first ionisation energy, ranks 11th here (0.027). One plausible reason is the oxidation-state fallback (Section 4.3): with correct oxidation states, ionic radii and Ewald energies become informative for all crystals and take over much of the signal.</w:t>
+        <w:t xml:space="preserve">The paper’s top feature, the A-site first ionisation energy, ranks 9th here (0.023). One plausible reason is the oxidation-state fallback (Section 4.3): with correct oxidation states, ionic radii and Ewald energies become informative for all crystals and take over much of the signal.</w:t>
       </w:r>
     </w:p>
     <w:bookmarkEnd w:id="120"/>
@@ -8757,10 +8486,7 @@
         <w:t xml:space="preserve">Different 246 crystals.</w:t>
       </w:r>
       <w:r>
-        <w:t xml:space="preserve"> </w:t>
-      </w:r>
-      <w:r>
-        <w:t xml:space="preserve">The paper does not say which 246 of the 2,652 oxides it used. Section 6.4 shows that a different 25-crystal test set alone can change R² by 0.2 or more.</w:t>
+        <w:t xml:space="preserve"> The paper does not say which 246 of the 2,652 oxides it used. Section 6.4 shows that a different 25-crystal test set alone can change R² by 0.2 or more.</w:t>
       </w:r>
     </w:p>
     <w:p>
@@ -8779,10 +8505,7 @@
         <w:t xml:space="preserve">XGBoost was probably scored on more crystals.</w:t>
       </w:r>
       <w:r>
-        <w:t xml:space="preserve"> </w:t>
-      </w:r>
-      <w:r>
-        <w:t xml:space="preserve">The paper’s XGBoost parity plot (Fig. 3c) shows well over 100 points, several times more than 25. If it was trained and tested on a larger set, the learning curve (Figure 11) shows that 0.861 is exactly what XGBoost reaches with 400–800 training crystals.</w:t>
+        <w:t xml:space="preserve"> The paper’s XGBoost parity plot (Fig. 3c) shows well over 100 points, several times more than 25. If it was trained and tested on a larger set, the learning curve (Figure 11) shows that 0.861 is exactly what XGBoost reaches with 400–800 training crystals.</w:t>
       </w:r>
     </w:p>
     <w:p>
@@ -8801,10 +8524,7 @@
         <w:t xml:space="preserve">Open design details.</w:t>
       </w:r>
       <w:r>
-        <w:t xml:space="preserve"> </w:t>
-      </w:r>
-      <w:r>
-        <w:t xml:space="preserve">How GENConv output becomes the 5×5 matrix, how ⟨Z⟩ values become an energy and how the node order is fixed are not given. This project made documented choices (Sections 4.3–4.6) that may differ from the authors’.</w:t>
+        <w:t xml:space="preserve"> How GENConv output becomes the 5×5 matrix, how ⟨Z⟩ values become an energy and how the node order is fixed are not given. This project made documented choices (Sections 4.3–4.6) that may differ from the authors’.</w:t>
       </w:r>
     </w:p>
     <w:p>
@@ -8823,10 +8543,7 @@
         <w:t xml:space="preserve">Simulator.</w:t>
       </w:r>
       <w:r>
-        <w:t xml:space="preserve"> </w:t>
-      </w:r>
-      <w:r>
-        <w:t xml:space="preserve">The paper used Qiskit’s EstimatorQNN with the QASM simulator; this project used exact statevector values for training and shot sampling only for scoring.</w:t>
+        <w:t xml:space="preserve"> The paper used Qiskit’s EstimatorQNN with the QASM simulator; this project used exact statevector values for training and shot sampling only for scoring.</w:t>
       </w:r>
     </w:p>
     <w:p>
@@ -8845,10 +8562,7 @@
         <w:t xml:space="preserve">An internal inconsistency in the paper.</w:t>
       </w:r>
       <w:r>
-        <w:t xml:space="preserve"> </w:t>
-      </w:r>
-      <w:r>
-        <w:t xml:space="preserve">The hybrid’s R² is 0.674 in the abstract and 0.626 in Figure 3b.</w:t>
+        <w:t xml:space="preserve"> The hybrid’s R² is 0.674 in the abstract and 0.626 in Figure 3b.</w:t>
       </w:r>
     </w:p>
     <w:bookmarkEnd w:id="121"/>
@@ -8878,10 +8592,7 @@
         <w:t xml:space="preserve">The pipeline works.</w:t>
       </w:r>
       <w:r>
-        <w:t xml:space="preserve"> </w:t>
-      </w:r>
-      <w:r>
-        <w:t xml:space="preserve">A gradient-free hybrid quantum GNN can be built and trained end to end on a laptop, and its circuit simulation is verified against Qiskit.</w:t>
+        <w:t xml:space="preserve"> A gradient-free hybrid quantum GNN can be built and trained end to end on a laptop, and its circuit simulation is verified against Qiskit.</w:t>
       </w:r>
     </w:p>
     <w:p>
@@ -8900,10 +8611,7 @@
         <w:t xml:space="preserve">The hybrid is competitive with the classical GNN, as the paper claims,</w:t>
       </w:r>
       <w:r>
-        <w:t xml:space="preserve"> </w:t>
-      </w:r>
-      <w:r>
-        <w:t xml:space="preserve">and on the paper-sized data set it is actually better on average (R² 0.43 vs 0.29).</w:t>
+        <w:t xml:space="preserve"> and on the paper-sized data set it is actually better on average (R² 0.43 vs 0.29).</w:t>
       </w:r>
     </w:p>
     <w:p>
@@ -8922,10 +8630,7 @@
         <w:t xml:space="preserve">But the gain is not from quantum learning.</w:t>
       </w:r>
       <w:r>
-        <w:t xml:space="preserve"> </w:t>
-      </w:r>
-      <w:r>
-        <w:t xml:space="preserve">A circuit with frozen random angles performs about as well, so the benefit comes from the normalised, bounded quantum feature map acting as a regulariser, not from training the quantum parameters.</w:t>
+        <w:t xml:space="preserve"> A circuit with frozen random angles performs about as well, so the benefit comes from the normalised, bounded quantum feature map acting as a regulariser, not from training the quantum parameters.</w:t>
       </w:r>
     </w:p>
     <w:p>
@@ -8944,10 +8649,7 @@
         <w:t xml:space="preserve">Classical gradient boosting remains clearly stronger</w:t>
       </w:r>
       <w:r>
-        <w:t xml:space="preserve"> </w:t>
-      </w:r>
-      <w:r>
-        <w:t xml:space="preserve">at every data size tested, and the gap widens as data grow.</w:t>
+        <w:t xml:space="preserve"> at every data size tested, and the gap widens as data grow.</w:t>
       </w:r>
     </w:p>
     <w:p>
@@ -8966,10 +8668,7 @@
         <w:t xml:space="preserve">Small test sets make single numbers unreliable.</w:t>
       </w:r>
       <w:r>
-        <w:t xml:space="preserve"> </w:t>
-      </w:r>
-      <w:r>
-        <w:t xml:space="preserve">Standard deviations of 0.1–0.2 in R² mean that any comparison on 25 test crystals needs multiple seeds or larger test sets.</w:t>
+        <w:t xml:space="preserve"> Standard deviations of 0.1–0.2 in R² mean that any comparison on 25 test crystals needs multiple seeds or larger test sets.</w:t>
       </w:r>
     </w:p>
     <w:bookmarkEnd w:id="122"/>
@@ -9007,7 +8706,7 @@
         <w:pStyle w:val="BodyText"/>
       </w:pPr>
       <w:r>
-        <w:t xml:space="preserve">On the paper’s data size (196 training crystals), the hybrid reaches a mean test R² of 0.43 ± 0.20 across five seeds, above the classical GENConv model (0.29 ± 0.16) on 4 of 5 seeds. XGBoost remains clearly better (0.68 ± 0.09, or 0.75 when tuned) and wins on every seed. Shot noise from 1,024 measurements barely matters, and five times more optimiser iterations change nothing.</w:t>
+        <w:t xml:space="preserve">On the paper’s data size (196 training crystals), the hybrid reaches a mean test R² of 0.43 ± 0.20 across five seeds, above the classical GENConv model (0.29 ± 0.16) on 4 of 5 seeds. XGBoost remains clearly better (0.66 ± 0.12, or 0.73 when tuned) and wins on every seed. Shot noise from 1,024 measurements barely matters, and five times more optimiser iterations change nothing.</w:t>
       </w:r>
     </w:p>
     <w:p>
@@ -9053,10 +8752,7 @@
         <w:t xml:space="preserve">Small data.</w:t>
       </w:r>
       <w:r>
-        <w:t xml:space="preserve"> </w:t>
-      </w:r>
-      <w:r>
-        <w:t xml:space="preserve">The main experiments use 246 crystals and 25-crystal test sets, which gives R² standard deviations of 0.1–0.2.</w:t>
+        <w:t xml:space="preserve"> The main experiments use 246 crystals and 25-crystal test sets, which gives R² standard deviations of 0.1–0.2.</w:t>
       </w:r>
     </w:p>
     <w:p>
@@ -9075,10 +8771,7 @@
         <w:t xml:space="preserve">Five seeds.</w:t>
       </w:r>
       <w:r>
-        <w:t xml:space="preserve"> </w:t>
-      </w:r>
-      <w:r>
-        <w:t xml:space="preserve">Enough to show the spread, too few for formal significance tests on small differences such as trained vs frozen circuit.</w:t>
+        <w:t xml:space="preserve"> Enough to show the spread, too few for formal significance tests on small differences such as trained vs frozen circuit.</w:t>
       </w:r>
     </w:p>
     <w:p>
@@ -9097,10 +8790,7 @@
         <w:t xml:space="preserve">Simulation only.</w:t>
       </w:r>
       <w:r>
-        <w:t xml:space="preserve"> </w:t>
-      </w:r>
-      <w:r>
-        <w:t xml:space="preserve">No quantum hardware was used and gate noise, decoherence and readout errors were not modelled; only shot noise was.</w:t>
+        <w:t xml:space="preserve"> No quantum hardware was used and gate noise, decoherence and readout errors were not modelled; only shot noise was.</w:t>
       </w:r>
     </w:p>
     <w:p>
@@ -9119,10 +8809,7 @@
         <w:t xml:space="preserve">Interpretation choices.</w:t>
       </w:r>
       <w:r>
-        <w:t xml:space="preserve"> </w:t>
-      </w:r>
-      <w:r>
-        <w:t xml:space="preserve">The 5×5 reduction, zero-padding to 32 amplitudes and the weighted ⟨Z⟩ output head are reasonable readings of the paper, not confirmed copies of the authors’ code.</w:t>
+        <w:t xml:space="preserve"> The 5×5 reduction, zero-padding to 32 amplitudes and the weighted ⟨Z⟩ output head are reasonable readings of the paper, not confirmed copies of the authors’ code.</w:t>
       </w:r>
     </w:p>
     <w:p>
@@ -9141,10 +8828,7 @@
         <w:t xml:space="preserve">Different sample.</w:t>
       </w:r>
       <w:r>
-        <w:t xml:space="preserve"> </w:t>
-      </w:r>
-      <w:r>
-        <w:t xml:space="preserve">The exact 246 crystals used in the paper are unknown, so the numbers cannot be compared one to one.</w:t>
+        <w:t xml:space="preserve"> The exact 246 crystals used in the paper are unknown, so the numbers cannot be compared one to one.</w:t>
       </w:r>
     </w:p>
     <w:p>
@@ -9163,10 +8847,7 @@
         <w:t xml:space="preserve">Exact state preparation.</w:t>
       </w:r>
       <w:r>
-        <w:t xml:space="preserve"> </w:t>
-      </w:r>
-      <w:r>
-        <w:t xml:space="preserve">Amplitude encoding is simulated as an exact state. On hardware it needs a deep state-preparation circuit, which would add noise and cost.</w:t>
+        <w:t xml:space="preserve"> Amplitude encoding is simulated as an exact state. On hardware it needs a deep state-preparation circuit, which would add noise and cost.</w:t>
       </w:r>
     </w:p>
     <w:p>
@@ -9185,10 +8866,7 @@
         <w:t xml:space="preserve">One small circuit.</w:t>
       </w:r>
       <w:r>
-        <w:t xml:space="preserve"> </w:t>
-      </w:r>
-      <w:r>
-        <w:t xml:space="preserve">Only one ansatz with one layer and 5 qubits was studied.</w:t>
+        <w:t xml:space="preserve"> Only one ansatz with one layer and 5 qubits was studied.</w:t>
       </w:r>
     </w:p>
     <w:bookmarkEnd w:id="125"/>
@@ -9218,10 +8896,7 @@
         <w:t xml:space="preserve">Hardware and noise models.</w:t>
       </w:r>
       <w:r>
-        <w:t xml:space="preserve"> </w:t>
-      </w:r>
-      <w:r>
-        <w:t xml:space="preserve">Run the trained circuit on a Qiskit noise model and on an IBM Quantum device to measure the effect of gate errors, and compare with the 1,024-shot result.</w:t>
+        <w:t xml:space="preserve"> Run the trained circuit on a Qiskit noise model and on an IBM Quantum device to measure the effect of gate errors, and compare with the 1,024-shot result.</w:t>
       </w:r>
     </w:p>
     <w:p>
@@ -9240,10 +8915,7 @@
         <w:t xml:space="preserve">Larger and repeated test sets.</w:t>
       </w:r>
       <w:r>
-        <w:t xml:space="preserve"> </w:t>
-      </w:r>
-      <w:r>
-        <w:t xml:space="preserve">Use cross-validation or the full 2,652-crystal set with many seeds, so model differences can be tested statistically.</w:t>
+        <w:t xml:space="preserve"> Use cross-validation or the full 2,652-crystal set with many seeds, so model differences can be tested statistically.</w:t>
       </w:r>
     </w:p>
     <w:p>
@@ -9262,10 +8934,7 @@
         <w:t xml:space="preserve">Deeper or different circuits.</w:t>
       </w:r>
       <w:r>
-        <w:t xml:space="preserve"> </w:t>
-      </w:r>
-      <w:r>
-        <w:t xml:space="preserve">Try several ansatz layers, data re-uploading or angle encoding, and check whether a trained circuit then beats a frozen one.</w:t>
+        <w:t xml:space="preserve"> Try several ansatz layers, data re-uploading or angle encoding, and check whether a trained circuit then beats a frozen one.</w:t>
       </w:r>
     </w:p>
     <w:p>
@@ -9284,10 +8953,7 @@
         <w:t xml:space="preserve">Hybrid with stronger classical parts.</w:t>
       </w:r>
       <w:r>
-        <w:t xml:space="preserve"> </w:t>
-      </w:r>
-      <w:r>
-        <w:t xml:space="preserve">Add more GENConv layers or a wider hidden size; with more data, gradient-based training of the classical part (with parameter-shift or simultaneous perturbation for the circuit) could also be compared.</w:t>
+        <w:t xml:space="preserve"> Add more GENConv layers or a wider hidden size; with more data, gradient-based training of the classical part (with parameter-shift or simultaneous perturbation for the circuit) could also be compared.</w:t>
       </w:r>
     </w:p>
     <w:p>
@@ -9306,10 +8972,7 @@
         <w:t xml:space="preserve">Quantum graph embedding.</w:t>
       </w:r>
       <w:r>
-        <w:t xml:space="preserve"> </w:t>
-      </w:r>
-      <w:r>
-        <w:t xml:space="preserve">Encode the graph structure itself into the circuit (for example one qubit per atom with entangling gates along bonds) instead of amplitude-encoding a flattened matrix, as the paper suggests.</w:t>
+        <w:t xml:space="preserve"> Encode the graph structure itself into the circuit (for example one qubit per atom with entangling gates along bonds) instead of amplitude-encoding a flattened matrix, as the paper suggests.</w:t>
       </w:r>
     </w:p>
     <w:p>
@@ -9328,10 +8991,7 @@
         <w:t xml:space="preserve">Other properties and materials.</w:t>
       </w:r>
       <w:r>
-        <w:t xml:space="preserve"> </w:t>
-      </w:r>
-      <w:r>
-        <w:t xml:space="preserve">Apply the same pipeline to band gaps or to other MatBench tasks to test whether the conclusions generalise.</w:t>
+        <w:t xml:space="preserve"> Apply the same pipeline to band gaps or to other MatBench tasks to test whether the conclusions generalise.</w:t>
       </w:r>
     </w:p>
     <w:bookmarkEnd w:id="126"/>
@@ -9606,13 +9266,7 @@
               <w:rPr>
                 <w:sz w:val="19"/>
               </w:rPr>
-              <w:t xml:space="preserve">,</w:t>
-            </w:r>
-            <w:r>
-              <w:rPr>
-                <w:sz w:val="19"/>
-              </w:rPr>
-              <w:t xml:space="preserve"> </w:t>
+              <w:t xml:space="preserve">, </w:t>
             </w:r>
             <w:r>
               <w:rPr>
@@ -9625,13 +9279,7 @@
               <w:rPr>
                 <w:sz w:val="19"/>
               </w:rPr>
-              <w:t xml:space="preserve">,</w:t>
-            </w:r>
-            <w:r>
-              <w:rPr>
-                <w:sz w:val="19"/>
-              </w:rPr>
-              <w:t xml:space="preserve"> </w:t>
+              <w:t xml:space="preserve">, </w:t>
             </w:r>
             <w:r>
               <w:rPr>
@@ -9786,13 +9434,7 @@
               <w:rPr>
                 <w:sz w:val="19"/>
               </w:rPr>
-              <w:t xml:space="preserve">,</w:t>
-            </w:r>
-            <w:r>
-              <w:rPr>
-                <w:sz w:val="19"/>
-              </w:rPr>
-              <w:t xml:space="preserve"> </w:t>
+              <w:t xml:space="preserve">, </w:t>
             </w:r>
             <w:r>
               <w:rPr>
@@ -9872,13 +9514,7 @@
               <w:rPr>
                 <w:sz w:val="19"/>
               </w:rPr>
-              <w:t xml:space="preserve">,</w:t>
-            </w:r>
-            <w:r>
-              <w:rPr>
-                <w:sz w:val="19"/>
-              </w:rPr>
-              <w:t xml:space="preserve"> </w:t>
+              <w:t xml:space="preserve">, </w:t>
             </w:r>
             <w:r>
               <w:rPr>
@@ -9891,13 +9527,7 @@
               <w:rPr>
                 <w:sz w:val="19"/>
               </w:rPr>
-              <w:t xml:space="preserve">,</w:t>
-            </w:r>
-            <w:r>
-              <w:rPr>
-                <w:sz w:val="19"/>
-              </w:rPr>
-              <w:t xml:space="preserve"> </w:t>
+              <w:t xml:space="preserve">, </w:t>
             </w:r>
             <w:r>
               <w:rPr>
@@ -9910,13 +9540,7 @@
               <w:rPr>
                 <w:sz w:val="19"/>
               </w:rPr>
-              <w:t xml:space="preserve">,</w:t>
-            </w:r>
-            <w:r>
-              <w:rPr>
-                <w:sz w:val="19"/>
-              </w:rPr>
-              <w:t xml:space="preserve"> </w:t>
+              <w:t xml:space="preserve">, </w:t>
             </w:r>
             <w:r>
               <w:rPr>
@@ -9949,28 +9573,7 @@
         <w:pStyle w:val="Compact"/>
       </w:pPr>
       <w:r>
-        <w:t xml:space="preserve">M. Vitz, H. Mohammadbagherpoor, S. Sandeep, A. Vlasic, R. Padbury and A. Pham,</w:t>
-      </w:r>
-      <w:r>
-        <w:t xml:space="preserve"> </w:t>
-      </w:r>
-      <w:r>
-        <w:t xml:space="preserve">“</w:t>
-      </w:r>
-      <w:r>
-        <w:t xml:space="preserve">Hybrid Quantum Graph Neural Network for Molecular Property Prediction,</w:t>
-      </w:r>
-      <w:r>
-        <w:t xml:space="preserve">”</w:t>
-      </w:r>
-      <w:r>
-        <w:t xml:space="preserve"> </w:t>
-      </w:r>
-      <w:r>
-        <w:t xml:space="preserve">arXiv:2405.05205, 2024.</w:t>
-      </w:r>
-      <w:r>
-        <w:t xml:space="preserve"> </w:t>
+        <w:t xml:space="preserve">M. Vitz, H. Mohammadbagherpoor, S. Sandeep, A. Vlasic, R. Padbury and A. Pham, “Hybrid Quantum Graph Neural Network for Molecular Property Prediction,” arXiv:2405.05205, 2024. </w:t>
       </w:r>
       <w:hyperlink r:id="rId129">
         <w:r>
@@ -9990,22 +9593,7 @@
         <w:pStyle w:val="Compact"/>
       </w:pPr>
       <w:r>
-        <w:t xml:space="preserve">I. E. Castelli, D. D. Landis, K. S. Thygesen et al.,</w:t>
-      </w:r>
-      <w:r>
-        <w:t xml:space="preserve"> </w:t>
-      </w:r>
-      <w:r>
-        <w:t xml:space="preserve">“</w:t>
-      </w:r>
-      <w:r>
-        <w:t xml:space="preserve">New cubic perovskites for one- and two-photon water splitting using the computational materials repository,</w:t>
-      </w:r>
-      <w:r>
-        <w:t xml:space="preserve">”</w:t>
-      </w:r>
-      <w:r>
-        <w:t xml:space="preserve"> </w:t>
+        <w:t xml:space="preserve">I. E. Castelli, D. D. Landis, K. S. Thygesen et al., “New cubic perovskites for one- and two-photon water splitting using the computational materials repository,” </w:t>
       </w:r>
       <w:r>
         <w:rPr>
@@ -10027,22 +9615,7 @@
         <w:pStyle w:val="Compact"/>
       </w:pPr>
       <w:r>
-        <w:t xml:space="preserve">A. Dunn, Q. Wang, A. Ganose, D. Dopp and A. Jain,</w:t>
-      </w:r>
-      <w:r>
-        <w:t xml:space="preserve"> </w:t>
-      </w:r>
-      <w:r>
-        <w:t xml:space="preserve">“</w:t>
-      </w:r>
-      <w:r>
-        <w:t xml:space="preserve">Benchmarking materials property prediction methods: the Matbench test set and Automatminer reference algorithm,</w:t>
-      </w:r>
-      <w:r>
-        <w:t xml:space="preserve">”</w:t>
-      </w:r>
-      <w:r>
-        <w:t xml:space="preserve"> </w:t>
+        <w:t xml:space="preserve">A. Dunn, Q. Wang, A. Ganose, D. Dopp and A. Jain, “Benchmarking materials property prediction methods: the Matbench test set and Automatminer reference algorithm,” </w:t>
       </w:r>
       <w:r>
         <w:rPr>
@@ -10064,25 +9637,7 @@
         <w:pStyle w:val="Compact"/>
       </w:pPr>
       <w:r>
-        <w:t xml:space="preserve">G. Li, C. Xiong, A. Thabet and B. Ghanem,</w:t>
-      </w:r>
-      <w:r>
-        <w:t xml:space="preserve"> </w:t>
-      </w:r>
-      <w:r>
-        <w:t xml:space="preserve">“</w:t>
-      </w:r>
-      <w:r>
-        <w:t xml:space="preserve">DeeperGCN: All You Need to Train Deeper GCNs,</w:t>
-      </w:r>
-      <w:r>
-        <w:t xml:space="preserve">”</w:t>
-      </w:r>
-      <w:r>
-        <w:t xml:space="preserve"> </w:t>
-      </w:r>
-      <w:r>
-        <w:t xml:space="preserve">arXiv:2006.07739, 2020.</w:t>
+        <w:t xml:space="preserve">G. Li, C. Xiong, A. Thabet and B. Ghanem, “DeeperGCN: All You Need to Train Deeper GCNs,” arXiv:2006.07739, 2020.</w:t>
       </w:r>
     </w:p>
     <w:p>
@@ -10094,28 +9649,7 @@
         <w:pStyle w:val="Compact"/>
       </w:pPr>
       <w:r>
-        <w:t xml:space="preserve">J. Rapin and O. Teytaud,</w:t>
-      </w:r>
-      <w:r>
-        <w:t xml:space="preserve"> </w:t>
-      </w:r>
-      <w:r>
-        <w:t xml:space="preserve">“</w:t>
-      </w:r>
-      <w:r>
-        <w:t xml:space="preserve">Nevergrad — A gradient-free optimization platform,</w:t>
-      </w:r>
-      <w:r>
-        <w:t xml:space="preserve">”</w:t>
-      </w:r>
-      <w:r>
-        <w:t xml:space="preserve"> </w:t>
-      </w:r>
-      <w:r>
-        <w:t xml:space="preserve">GitHub repository, 2018.</w:t>
-      </w:r>
-      <w:r>
-        <w:t xml:space="preserve"> </w:t>
+        <w:t xml:space="preserve">J. Rapin and O. Teytaud, “Nevergrad — A gradient-free optimization platform,” GitHub repository, 2018. </w:t>
       </w:r>
       <w:hyperlink r:id="rId130">
         <w:r>
@@ -10135,22 +9669,7 @@
         <w:pStyle w:val="Compact"/>
       </w:pPr>
       <w:r>
-        <w:t xml:space="preserve">L. Meunier, H. Rakotoarison, P. K. Wong et al.,</w:t>
-      </w:r>
-      <w:r>
-        <w:t xml:space="preserve"> </w:t>
-      </w:r>
-      <w:r>
-        <w:t xml:space="preserve">“</w:t>
-      </w:r>
-      <w:r>
-        <w:t xml:space="preserve">Black-Box Optimization Revisited: Improving Algorithm Selection Wizards Through Massive Benchmarking,</w:t>
-      </w:r>
-      <w:r>
-        <w:t xml:space="preserve">”</w:t>
-      </w:r>
-      <w:r>
-        <w:t xml:space="preserve"> </w:t>
+        <w:t xml:space="preserve">L. Meunier, H. Rakotoarison, P. K. Wong et al., “Black-Box Optimization Revisited: Improving Algorithm Selection Wizards Through Massive Benchmarking,” </w:t>
       </w:r>
       <w:r>
         <w:rPr>
@@ -10172,22 +9691,7 @@
         <w:pStyle w:val="Compact"/>
       </w:pPr>
       <w:r>
-        <w:t xml:space="preserve">T. Chen and C. Guestrin,</w:t>
-      </w:r>
-      <w:r>
-        <w:t xml:space="preserve"> </w:t>
-      </w:r>
-      <w:r>
-        <w:t xml:space="preserve">“</w:t>
-      </w:r>
-      <w:r>
-        <w:t xml:space="preserve">XGBoost: A Scalable Tree Boosting System,</w:t>
-      </w:r>
-      <w:r>
-        <w:t xml:space="preserve">”</w:t>
-      </w:r>
-      <w:r>
-        <w:t xml:space="preserve"> </w:t>
+        <w:t xml:space="preserve">T. Chen and C. Guestrin, “XGBoost: A Scalable Tree Boosting System,” </w:t>
       </w:r>
       <w:r>
         <w:rPr>
@@ -10209,22 +9713,7 @@
         <w:pStyle w:val="Compact"/>
       </w:pPr>
       <w:r>
-        <w:t xml:space="preserve">S. P. Ong, W. D. Richards, A. Jain et al.,</w:t>
-      </w:r>
-      <w:r>
-        <w:t xml:space="preserve"> </w:t>
-      </w:r>
-      <w:r>
-        <w:t xml:space="preserve">“</w:t>
-      </w:r>
-      <w:r>
-        <w:t xml:space="preserve">Python Materials Genomics (pymatgen): A robust, open-source python library for materials analysis,</w:t>
-      </w:r>
-      <w:r>
-        <w:t xml:space="preserve">”</w:t>
-      </w:r>
-      <w:r>
-        <w:t xml:space="preserve"> </w:t>
+        <w:t xml:space="preserve">S. P. Ong, W. D. Richards, A. Jain et al., “Python Materials Genomics (pymatgen): A robust, open-source python library for materials analysis,” </w:t>
       </w:r>
       <w:r>
         <w:rPr>
@@ -10246,22 +9735,7 @@
         <w:pStyle w:val="Compact"/>
       </w:pPr>
       <w:r>
-        <w:t xml:space="preserve">T. Xie and J. C. Grossman,</w:t>
-      </w:r>
-      <w:r>
-        <w:t xml:space="preserve"> </w:t>
-      </w:r>
-      <w:r>
-        <w:t xml:space="preserve">“</w:t>
-      </w:r>
-      <w:r>
-        <w:t xml:space="preserve">Crystal Graph Convolutional Neural Networks for an Accurate and Interpretable Prediction of Material Properties,</w:t>
-      </w:r>
-      <w:r>
-        <w:t xml:space="preserve">”</w:t>
-      </w:r>
-      <w:r>
-        <w:t xml:space="preserve"> </w:t>
+        <w:t xml:space="preserve">T. Xie and J. C. Grossman, “Crystal Graph Convolutional Neural Networks for an Accurate and Interpretable Prediction of Material Properties,” </w:t>
       </w:r>
       <w:r>
         <w:rPr>
@@ -10283,22 +9757,7 @@
         <w:pStyle w:val="Compact"/>
       </w:pPr>
       <w:r>
-        <w:t xml:space="preserve">J. R. McClean, S. Boixo, V. N. Smelyanskiy, R. Babbush and H. Neven,</w:t>
-      </w:r>
-      <w:r>
-        <w:t xml:space="preserve"> </w:t>
-      </w:r>
-      <w:r>
-        <w:t xml:space="preserve">“</w:t>
-      </w:r>
-      <w:r>
-        <w:t xml:space="preserve">Barren plateaus in quantum neural network training landscapes,</w:t>
-      </w:r>
-      <w:r>
-        <w:t xml:space="preserve">”</w:t>
-      </w:r>
-      <w:r>
-        <w:t xml:space="preserve"> </w:t>
+        <w:t xml:space="preserve">J. R. McClean, S. Boixo, V. N. Smelyanskiy, R. Babbush and H. Neven, “Barren plateaus in quantum neural network training landscapes,” </w:t>
       </w:r>
       <w:r>
         <w:rPr>
@@ -10320,25 +9779,7 @@
         <w:pStyle w:val="Compact"/>
       </w:pPr>
       <w:r>
-        <w:t xml:space="preserve">M. Fey and J. E. Lenssen,</w:t>
-      </w:r>
-      <w:r>
-        <w:t xml:space="preserve"> </w:t>
-      </w:r>
-      <w:r>
-        <w:t xml:space="preserve">“</w:t>
-      </w:r>
-      <w:r>
-        <w:t xml:space="preserve">Fast Graph Representation Learning with PyTorch Geometric,</w:t>
-      </w:r>
-      <w:r>
-        <w:t xml:space="preserve">”</w:t>
-      </w:r>
-      <w:r>
-        <w:t xml:space="preserve"> </w:t>
-      </w:r>
-      <w:r>
-        <w:t xml:space="preserve">ICLR Workshop on Representation Learning on Graphs and Manifolds, 2019.</w:t>
+        <w:t xml:space="preserve">M. Fey and J. E. Lenssen, “Fast Graph Representation Learning with PyTorch Geometric,” ICLR Workshop on Representation Learning on Graphs and Manifolds, 2019.</w:t>
       </w:r>
     </w:p>
     <w:p>
@@ -10350,28 +9791,7 @@
         <w:pStyle w:val="Compact"/>
       </w:pPr>
       <w:r>
-        <w:t xml:space="preserve">A. Javadi-Abhari et al.,</w:t>
-      </w:r>
-      <w:r>
-        <w:t xml:space="preserve"> </w:t>
-      </w:r>
-      <w:r>
-        <w:t xml:space="preserve">“</w:t>
-      </w:r>
-      <w:r>
-        <w:t xml:space="preserve">Quantum computing with Qiskit,</w:t>
-      </w:r>
-      <w:r>
-        <w:t xml:space="preserve">”</w:t>
-      </w:r>
-      <w:r>
-        <w:t xml:space="preserve"> </w:t>
-      </w:r>
-      <w:r>
-        <w:t xml:space="preserve">arXiv:2405.08810, 2024.</w:t>
-      </w:r>
-      <w:r>
-        <w:t xml:space="preserve"> </w:t>
+        <w:t xml:space="preserve">A. Javadi-Abhari et al., “Quantum computing with Qiskit,” arXiv:2405.08810, 2024. </w:t>
       </w:r>
       <w:hyperlink r:id="rId131">
         <w:r>
@@ -10391,22 +9811,7 @@
         <w:pStyle w:val="Compact"/>
       </w:pPr>
       <w:r>
-        <w:t xml:space="preserve">A. Paszke et al.,</w:t>
-      </w:r>
-      <w:r>
-        <w:t xml:space="preserve"> </w:t>
-      </w:r>
-      <w:r>
-        <w:t xml:space="preserve">“</w:t>
-      </w:r>
-      <w:r>
-        <w:t xml:space="preserve">PyTorch: An Imperative Style, High-Performance Deep Learning Library,</w:t>
-      </w:r>
-      <w:r>
-        <w:t xml:space="preserve">”</w:t>
-      </w:r>
-      <w:r>
-        <w:t xml:space="preserve"> </w:t>
+        <w:t xml:space="preserve">A. Paszke et al., “PyTorch: An Imperative Style, High-Performance Deep Learning Library,” </w:t>
       </w:r>
       <w:r>
         <w:rPr>
@@ -10428,22 +9833,7 @@
         <w:pStyle w:val="Compact"/>
       </w:pPr>
       <w:r>
-        <w:t xml:space="preserve">L. Ward, A. Dunn, A. Faghaninia et al.,</w:t>
-      </w:r>
-      <w:r>
-        <w:t xml:space="preserve"> </w:t>
-      </w:r>
-      <w:r>
-        <w:t xml:space="preserve">“</w:t>
-      </w:r>
-      <w:r>
-        <w:t xml:space="preserve">Matminer: An open source toolkit for materials data mining,</w:t>
-      </w:r>
-      <w:r>
-        <w:t xml:space="preserve">”</w:t>
-      </w:r>
-      <w:r>
-        <w:t xml:space="preserve"> </w:t>
+        <w:t xml:space="preserve">L. Ward, A. Dunn, A. Faghaninia et al., “Matminer: An open source toolkit for materials data mining,” </w:t>
       </w:r>
       <w:r>
         <w:rPr>
@@ -10465,22 +9855,7 @@
         <w:pStyle w:val="Compact"/>
       </w:pPr>
       <w:r>
-        <w:t xml:space="preserve">M. Schuld, V. Bergholm, C. Gogolin, J. Izaac and N. Killoran,</w:t>
-      </w:r>
-      <w:r>
-        <w:t xml:space="preserve"> </w:t>
-      </w:r>
-      <w:r>
-        <w:t xml:space="preserve">“</w:t>
-      </w:r>
-      <w:r>
-        <w:t xml:space="preserve">Evaluating analytic gradients on quantum hardware,</w:t>
-      </w:r>
-      <w:r>
-        <w:t xml:space="preserve">”</w:t>
-      </w:r>
-      <w:r>
-        <w:t xml:space="preserve"> </w:t>
+        <w:t xml:space="preserve">M. Schuld, V. Bergholm, C. Gogolin, J. Izaac and N. Killoran, “Evaluating analytic gradients on quantum hardware,” </w:t>
       </w:r>
       <w:r>
         <w:rPr>
@@ -10615,13 +9990,7 @@
               <w:rPr>
                 <w:sz w:val="19"/>
               </w:rPr>
-              <w:t xml:space="preserve"> </w:t>
-            </w:r>
-            <w:r>
-              <w:rPr>
-                <w:sz w:val="19"/>
-              </w:rPr>
-              <w:t xml:space="preserve">(Castelli et al.), 18,928 cubic perovskites</w:t>
+              <w:t xml:space="preserve"> (Castelli et al.), 18,928 cubic perovskites</w:t>
             </w:r>
           </w:p>
         </w:tc>
@@ -11523,7 +10892,7 @@
               <w:rPr>
                 <w:sz w:val="19"/>
               </w:rPr>
-              <w:t xml:space="preserve">1,000 trees, learning rate 0.05, depth 4, subsample 0.9, colsample 0.9, early stopping 50 rounds</w:t>
+              <w:t xml:space="preserve">1,000 trees, learning rate 0.05, depth 4, subsample 0.9, colsample 0.9, early stopping 50 rounds, 1 CPU thread</w:t>
             </w:r>
           </w:p>
         </w:tc>
@@ -11579,25 +10948,7 @@
         <w:pStyle w:val="FirstParagraph"/>
       </w:pPr>
       <w:r>
-        <w:t xml:space="preserve">Each seed is a different 196/25/25 split, initialisation and optimiser run.</w:t>
-      </w:r>
-      <w:r>
-        <w:t xml:space="preserve"> </w:t>
-      </w:r>
-      <w:r>
-        <w:t xml:space="preserve">“</w:t>
-      </w:r>
-      <w:r>
-        <w:t xml:space="preserve">Mean ± std</w:t>
-      </w:r>
-      <w:r>
-        <w:t xml:space="preserve">”</w:t>
-      </w:r>
-      <w:r>
-        <w:t xml:space="preserve"> </w:t>
-      </w:r>
-      <w:r>
-        <w:t xml:space="preserve">uses the population standard deviation over the five seeds.</w:t>
+        <w:t xml:space="preserve">Each seed is a different 196/25/25 split, initialisation and optimiser run. “Mean ± std” uses the population standard deviation over the five seeds.</w:t>
       </w:r>
     </w:p>
     <w:p>
@@ -11810,87 +11161,87 @@
               <w:rPr>
                 <w:sz w:val="19"/>
               </w:rPr>
-              <w:t xml:space="preserve">0.667</w:t>
-            </w:r>
-          </w:p>
-        </w:tc>
-        <w:tc>
-          <w:tcPr/>
-          <w:p>
-            <w:pPr>
-              <w:pStyle w:val="Compact"/>
-              <w:spacing w:after="40"/>
-              <w:jc w:val="left"/>
-            </w:pPr>
-            <w:r>
-              <w:rPr>
-                <w:sz w:val="19"/>
-              </w:rPr>
-              <w:t xml:space="preserve">0.747</w:t>
-            </w:r>
-          </w:p>
-        </w:tc>
-        <w:tc>
-          <w:tcPr/>
-          <w:p>
-            <w:pPr>
-              <w:pStyle w:val="Compact"/>
-              <w:spacing w:after="40"/>
-              <w:jc w:val="left"/>
-            </w:pPr>
-            <w:r>
-              <w:rPr>
-                <w:sz w:val="19"/>
-              </w:rPr>
-              <w:t xml:space="preserve">0.514</w:t>
-            </w:r>
-          </w:p>
-        </w:tc>
-        <w:tc>
-          <w:tcPr/>
-          <w:p>
-            <w:pPr>
-              <w:pStyle w:val="Compact"/>
-              <w:spacing w:after="40"/>
-              <w:jc w:val="left"/>
-            </w:pPr>
-            <w:r>
-              <w:rPr>
-                <w:sz w:val="19"/>
-              </w:rPr>
-              <w:t xml:space="preserve">0.673</w:t>
-            </w:r>
-          </w:p>
-        </w:tc>
-        <w:tc>
-          <w:tcPr/>
-          <w:p>
-            <w:pPr>
-              <w:pStyle w:val="Compact"/>
-              <w:spacing w:after="40"/>
-              <w:jc w:val="left"/>
-            </w:pPr>
-            <w:r>
-              <w:rPr>
-                <w:sz w:val="19"/>
-              </w:rPr>
-              <w:t xml:space="preserve">0.771</w:t>
-            </w:r>
-          </w:p>
-        </w:tc>
-        <w:tc>
-          <w:tcPr/>
-          <w:p>
-            <w:pPr>
-              <w:pStyle w:val="Compact"/>
-              <w:spacing w:after="40"/>
-              <w:jc w:val="left"/>
-            </w:pPr>
-            <w:r>
-              <w:rPr>
-                <w:sz w:val="19"/>
-              </w:rPr>
-              <w:t xml:space="preserve">0.675 ± 0.090</w:t>
+              <w:t xml:space="preserve">0.661</w:t>
+            </w:r>
+          </w:p>
+        </w:tc>
+        <w:tc>
+          <w:tcPr/>
+          <w:p>
+            <w:pPr>
+              <w:pStyle w:val="Compact"/>
+              <w:spacing w:after="40"/>
+              <w:jc w:val="left"/>
+            </w:pPr>
+            <w:r>
+              <w:rPr>
+                <w:sz w:val="19"/>
+              </w:rPr>
+              <w:t xml:space="preserve">0.735</w:t>
+            </w:r>
+          </w:p>
+        </w:tc>
+        <w:tc>
+          <w:tcPr/>
+          <w:p>
+            <w:pPr>
+              <w:pStyle w:val="Compact"/>
+              <w:spacing w:after="40"/>
+              <w:jc w:val="left"/>
+            </w:pPr>
+            <w:r>
+              <w:rPr>
+                <w:sz w:val="19"/>
+              </w:rPr>
+              <w:t xml:space="preserve">0.441</w:t>
+            </w:r>
+          </w:p>
+        </w:tc>
+        <w:tc>
+          <w:tcPr/>
+          <w:p>
+            <w:pPr>
+              <w:pStyle w:val="Compact"/>
+              <w:spacing w:after="40"/>
+              <w:jc w:val="left"/>
+            </w:pPr>
+            <w:r>
+              <w:rPr>
+                <w:sz w:val="19"/>
+              </w:rPr>
+              <w:t xml:space="preserve">0.693</w:t>
+            </w:r>
+          </w:p>
+        </w:tc>
+        <w:tc>
+          <w:tcPr/>
+          <w:p>
+            <w:pPr>
+              <w:pStyle w:val="Compact"/>
+              <w:spacing w:after="40"/>
+              <w:jc w:val="left"/>
+            </w:pPr>
+            <w:r>
+              <w:rPr>
+                <w:sz w:val="19"/>
+              </w:rPr>
+              <w:t xml:space="preserve">0.791</w:t>
+            </w:r>
+          </w:p>
+        </w:tc>
+        <w:tc>
+          <w:tcPr/>
+          <w:p>
+            <w:pPr>
+              <w:pStyle w:val="Compact"/>
+              <w:spacing w:after="40"/>
+              <w:jc w:val="left"/>
+            </w:pPr>
+            <w:r>
+              <w:rPr>
+                <w:sz w:val="19"/>
+              </w:rPr>
+              <w:t xml:space="preserve">0.664 ± 0.120</w:t>
             </w:r>
           </w:p>
         </w:tc>
@@ -11928,97 +11279,97 @@
               <w:rPr>
                 <w:sz w:val="19"/>
               </w:rPr>
-              <w:t xml:space="preserve">0.804</w:t>
-            </w:r>
-          </w:p>
-        </w:tc>
-        <w:tc>
-          <w:tcPr>
-            <w:shd w:val="clear" w:color="auto" w:fill="F3F4F6"/>
-          </w:tcPr>
-          <w:p>
-            <w:pPr>
-              <w:pStyle w:val="Compact"/>
-              <w:spacing w:after="40"/>
-              <w:jc w:val="left"/>
-            </w:pPr>
-            <w:r>
-              <w:rPr>
-                <w:sz w:val="19"/>
-              </w:rPr>
-              <w:t xml:space="preserve">0.789</w:t>
-            </w:r>
-          </w:p>
-        </w:tc>
-        <w:tc>
-          <w:tcPr>
-            <w:shd w:val="clear" w:color="auto" w:fill="F3F4F6"/>
-          </w:tcPr>
-          <w:p>
-            <w:pPr>
-              <w:pStyle w:val="Compact"/>
-              <w:spacing w:after="40"/>
-              <w:jc w:val="left"/>
-            </w:pPr>
-            <w:r>
-              <w:rPr>
-                <w:sz w:val="19"/>
-              </w:rPr>
-              <w:t xml:space="preserve">0.567</w:t>
-            </w:r>
-          </w:p>
-        </w:tc>
-        <w:tc>
-          <w:tcPr>
-            <w:shd w:val="clear" w:color="auto" w:fill="F3F4F6"/>
-          </w:tcPr>
-          <w:p>
-            <w:pPr>
-              <w:pStyle w:val="Compact"/>
-              <w:spacing w:after="40"/>
-              <w:jc w:val="left"/>
-            </w:pPr>
-            <w:r>
-              <w:rPr>
-                <w:sz w:val="19"/>
-              </w:rPr>
-              <w:t xml:space="preserve">0.758</w:t>
-            </w:r>
-          </w:p>
-        </w:tc>
-        <w:tc>
-          <w:tcPr>
-            <w:shd w:val="clear" w:color="auto" w:fill="F3F4F6"/>
-          </w:tcPr>
-          <w:p>
-            <w:pPr>
-              <w:pStyle w:val="Compact"/>
-              <w:spacing w:after="40"/>
-              <w:jc w:val="left"/>
-            </w:pPr>
-            <w:r>
-              <w:rPr>
-                <w:sz w:val="19"/>
-              </w:rPr>
-              <w:t xml:space="preserve">0.829</w:t>
-            </w:r>
-          </w:p>
-        </w:tc>
-        <w:tc>
-          <w:tcPr>
-            <w:shd w:val="clear" w:color="auto" w:fill="F3F4F6"/>
-          </w:tcPr>
-          <w:p>
-            <w:pPr>
-              <w:pStyle w:val="Compact"/>
-              <w:spacing w:after="40"/>
-              <w:jc w:val="left"/>
-            </w:pPr>
-            <w:r>
-              <w:rPr>
-                <w:sz w:val="19"/>
-              </w:rPr>
-              <w:t xml:space="preserve">0.749 ± 0.094</w:t>
+              <w:t xml:space="preserve">0.827</w:t>
+            </w:r>
+          </w:p>
+        </w:tc>
+        <w:tc>
+          <w:tcPr>
+            <w:shd w:val="clear" w:color="auto" w:fill="F3F4F6"/>
+          </w:tcPr>
+          <w:p>
+            <w:pPr>
+              <w:pStyle w:val="Compact"/>
+              <w:spacing w:after="40"/>
+              <w:jc w:val="left"/>
+            </w:pPr>
+            <w:r>
+              <w:rPr>
+                <w:sz w:val="19"/>
+              </w:rPr>
+              <w:t xml:space="preserve">0.796</w:t>
+            </w:r>
+          </w:p>
+        </w:tc>
+        <w:tc>
+          <w:tcPr>
+            <w:shd w:val="clear" w:color="auto" w:fill="F3F4F6"/>
+          </w:tcPr>
+          <w:p>
+            <w:pPr>
+              <w:pStyle w:val="Compact"/>
+              <w:spacing w:after="40"/>
+              <w:jc w:val="left"/>
+            </w:pPr>
+            <w:r>
+              <w:rPr>
+                <w:sz w:val="19"/>
+              </w:rPr>
+              <w:t xml:space="preserve">0.483</w:t>
+            </w:r>
+          </w:p>
+        </w:tc>
+        <w:tc>
+          <w:tcPr>
+            <w:shd w:val="clear" w:color="auto" w:fill="F3F4F6"/>
+          </w:tcPr>
+          <w:p>
+            <w:pPr>
+              <w:pStyle w:val="Compact"/>
+              <w:spacing w:after="40"/>
+              <w:jc w:val="left"/>
+            </w:pPr>
+            <w:r>
+              <w:rPr>
+                <w:sz w:val="19"/>
+              </w:rPr>
+              <w:t xml:space="preserve">0.676</w:t>
+            </w:r>
+          </w:p>
+        </w:tc>
+        <w:tc>
+          <w:tcPr>
+            <w:shd w:val="clear" w:color="auto" w:fill="F3F4F6"/>
+          </w:tcPr>
+          <w:p>
+            <w:pPr>
+              <w:pStyle w:val="Compact"/>
+              <w:spacing w:after="40"/>
+              <w:jc w:val="left"/>
+            </w:pPr>
+            <w:r>
+              <w:rPr>
+                <w:sz w:val="19"/>
+              </w:rPr>
+              <w:t xml:space="preserve">0.870</w:t>
+            </w:r>
+          </w:p>
+        </w:tc>
+        <w:tc>
+          <w:tcPr>
+            <w:shd w:val="clear" w:color="auto" w:fill="F3F4F6"/>
+          </w:tcPr>
+          <w:p>
+            <w:pPr>
+              <w:pStyle w:val="Compact"/>
+              <w:spacing w:after="40"/>
+              <w:jc w:val="left"/>
+            </w:pPr>
+            <w:r>
+              <w:rPr>
+                <w:sz w:val="19"/>
+              </w:rPr>
+              <w:t xml:space="preserve">0.730 ± 0.140</w:t>
             </w:r>
           </w:p>
         </w:tc>
@@ -13202,87 +12553,87 @@
               <w:rPr>
                 <w:sz w:val="19"/>
               </w:rPr>
-              <w:t xml:space="preserve">0.665</w:t>
-            </w:r>
-          </w:p>
-        </w:tc>
-        <w:tc>
-          <w:tcPr/>
-          <w:p>
-            <w:pPr>
-              <w:pStyle w:val="Compact"/>
-              <w:spacing w:after="40"/>
-              <w:jc w:val="left"/>
-            </w:pPr>
-            <w:r>
-              <w:rPr>
-                <w:sz w:val="19"/>
-              </w:rPr>
-              <w:t xml:space="preserve">0.644</w:t>
-            </w:r>
-          </w:p>
-        </w:tc>
-        <w:tc>
-          <w:tcPr/>
-          <w:p>
-            <w:pPr>
-              <w:pStyle w:val="Compact"/>
-              <w:spacing w:after="40"/>
-              <w:jc w:val="left"/>
-            </w:pPr>
-            <w:r>
-              <w:rPr>
-                <w:sz w:val="19"/>
-              </w:rPr>
-              <w:t xml:space="preserve">0.509</w:t>
-            </w:r>
-          </w:p>
-        </w:tc>
-        <w:tc>
-          <w:tcPr/>
-          <w:p>
-            <w:pPr>
-              <w:pStyle w:val="Compact"/>
-              <w:spacing w:after="40"/>
-              <w:jc w:val="left"/>
-            </w:pPr>
-            <w:r>
-              <w:rPr>
-                <w:sz w:val="19"/>
-              </w:rPr>
-              <w:t xml:space="preserve">0.635</w:t>
-            </w:r>
-          </w:p>
-        </w:tc>
-        <w:tc>
-          <w:tcPr/>
-          <w:p>
-            <w:pPr>
-              <w:pStyle w:val="Compact"/>
-              <w:spacing w:after="40"/>
-              <w:jc w:val="left"/>
-            </w:pPr>
-            <w:r>
-              <w:rPr>
-                <w:sz w:val="19"/>
-              </w:rPr>
-              <w:t xml:space="preserve">0.741</w:t>
-            </w:r>
-          </w:p>
-        </w:tc>
-        <w:tc>
-          <w:tcPr/>
-          <w:p>
-            <w:pPr>
-              <w:pStyle w:val="Compact"/>
-              <w:spacing w:after="40"/>
-              <w:jc w:val="left"/>
-            </w:pPr>
-            <w:r>
-              <w:rPr>
-                <w:sz w:val="19"/>
-              </w:rPr>
-              <w:t xml:space="preserve">0.639 ± 0.075</w:t>
+              <w:t xml:space="preserve">0.657</w:t>
+            </w:r>
+          </w:p>
+        </w:tc>
+        <w:tc>
+          <w:tcPr/>
+          <w:p>
+            <w:pPr>
+              <w:pStyle w:val="Compact"/>
+              <w:spacing w:after="40"/>
+              <w:jc w:val="left"/>
+            </w:pPr>
+            <w:r>
+              <w:rPr>
+                <w:sz w:val="19"/>
+              </w:rPr>
+              <w:t xml:space="preserve">0.631</w:t>
+            </w:r>
+          </w:p>
+        </w:tc>
+        <w:tc>
+          <w:tcPr/>
+          <w:p>
+            <w:pPr>
+              <w:pStyle w:val="Compact"/>
+              <w:spacing w:after="40"/>
+              <w:jc w:val="left"/>
+            </w:pPr>
+            <w:r>
+              <w:rPr>
+                <w:sz w:val="19"/>
+              </w:rPr>
+              <w:t xml:space="preserve">0.435</w:t>
+            </w:r>
+          </w:p>
+        </w:tc>
+        <w:tc>
+          <w:tcPr/>
+          <w:p>
+            <w:pPr>
+              <w:pStyle w:val="Compact"/>
+              <w:spacing w:after="40"/>
+              <w:jc w:val="left"/>
+            </w:pPr>
+            <w:r>
+              <w:rPr>
+                <w:sz w:val="19"/>
+              </w:rPr>
+              <w:t xml:space="preserve">0.676</w:t>
+            </w:r>
+          </w:p>
+        </w:tc>
+        <w:tc>
+          <w:tcPr/>
+          <w:p>
+            <w:pPr>
+              <w:pStyle w:val="Compact"/>
+              <w:spacing w:after="40"/>
+              <w:jc w:val="left"/>
+            </w:pPr>
+            <w:r>
+              <w:rPr>
+                <w:sz w:val="19"/>
+              </w:rPr>
+              <w:t xml:space="preserve">0.758</w:t>
+            </w:r>
+          </w:p>
+        </w:tc>
+        <w:tc>
+          <w:tcPr/>
+          <w:p>
+            <w:pPr>
+              <w:pStyle w:val="Compact"/>
+              <w:spacing w:after="40"/>
+              <w:jc w:val="left"/>
+            </w:pPr>
+            <w:r>
+              <w:rPr>
+                <w:sz w:val="19"/>
+              </w:rPr>
+              <w:t xml:space="preserve">0.631 ± 0.107</w:t>
             </w:r>
           </w:p>
         </w:tc>
@@ -13320,97 +12671,97 @@
               <w:rPr>
                 <w:sz w:val="19"/>
               </w:rPr>
-              <w:t xml:space="preserve">0.797</w:t>
-            </w:r>
-          </w:p>
-        </w:tc>
-        <w:tc>
-          <w:tcPr>
-            <w:shd w:val="clear" w:color="auto" w:fill="F3F4F6"/>
-          </w:tcPr>
-          <w:p>
-            <w:pPr>
-              <w:pStyle w:val="Compact"/>
-              <w:spacing w:after="40"/>
-              <w:jc w:val="left"/>
-            </w:pPr>
-            <w:r>
-              <w:rPr>
-                <w:sz w:val="19"/>
-              </w:rPr>
-              <w:t xml:space="preserve">0.708</w:t>
-            </w:r>
-          </w:p>
-        </w:tc>
-        <w:tc>
-          <w:tcPr>
-            <w:shd w:val="clear" w:color="auto" w:fill="F3F4F6"/>
-          </w:tcPr>
-          <w:p>
-            <w:pPr>
-              <w:pStyle w:val="Compact"/>
-              <w:spacing w:after="40"/>
-              <w:jc w:val="left"/>
-            </w:pPr>
-            <w:r>
-              <w:rPr>
-                <w:sz w:val="19"/>
-              </w:rPr>
-              <w:t xml:space="preserve">0.560</w:t>
-            </w:r>
-          </w:p>
-        </w:tc>
-        <w:tc>
-          <w:tcPr>
-            <w:shd w:val="clear" w:color="auto" w:fill="F3F4F6"/>
-          </w:tcPr>
-          <w:p>
-            <w:pPr>
-              <w:pStyle w:val="Compact"/>
-              <w:spacing w:after="40"/>
-              <w:jc w:val="left"/>
-            </w:pPr>
-            <w:r>
-              <w:rPr>
-                <w:sz w:val="19"/>
-              </w:rPr>
-              <w:t xml:space="preserve">0.735</w:t>
-            </w:r>
-          </w:p>
-        </w:tc>
-        <w:tc>
-          <w:tcPr>
-            <w:shd w:val="clear" w:color="auto" w:fill="F3F4F6"/>
-          </w:tcPr>
-          <w:p>
-            <w:pPr>
-              <w:pStyle w:val="Compact"/>
-              <w:spacing w:after="40"/>
-              <w:jc w:val="left"/>
-            </w:pPr>
-            <w:r>
-              <w:rPr>
-                <w:sz w:val="19"/>
-              </w:rPr>
-              <w:t xml:space="preserve">0.817</w:t>
-            </w:r>
-          </w:p>
-        </w:tc>
-        <w:tc>
-          <w:tcPr>
-            <w:shd w:val="clear" w:color="auto" w:fill="F3F4F6"/>
-          </w:tcPr>
-          <w:p>
-            <w:pPr>
-              <w:pStyle w:val="Compact"/>
-              <w:spacing w:after="40"/>
-              <w:jc w:val="left"/>
-            </w:pPr>
-            <w:r>
-              <w:rPr>
-                <w:sz w:val="19"/>
-              </w:rPr>
-              <w:t xml:space="preserve">0.723 ± 0.091</w:t>
+              <w:t xml:space="preserve">0.816</w:t>
+            </w:r>
+          </w:p>
+        </w:tc>
+        <w:tc>
+          <w:tcPr>
+            <w:shd w:val="clear" w:color="auto" w:fill="F3F4F6"/>
+          </w:tcPr>
+          <w:p>
+            <w:pPr>
+              <w:pStyle w:val="Compact"/>
+              <w:spacing w:after="40"/>
+              <w:jc w:val="left"/>
+            </w:pPr>
+            <w:r>
+              <w:rPr>
+                <w:sz w:val="19"/>
+              </w:rPr>
+              <w:t xml:space="preserve">0.715</w:t>
+            </w:r>
+          </w:p>
+        </w:tc>
+        <w:tc>
+          <w:tcPr>
+            <w:shd w:val="clear" w:color="auto" w:fill="F3F4F6"/>
+          </w:tcPr>
+          <w:p>
+            <w:pPr>
+              <w:pStyle w:val="Compact"/>
+              <w:spacing w:after="40"/>
+              <w:jc w:val="left"/>
+            </w:pPr>
+            <w:r>
+              <w:rPr>
+                <w:sz w:val="19"/>
+              </w:rPr>
+              <w:t xml:space="preserve">0.462</w:t>
+            </w:r>
+          </w:p>
+        </w:tc>
+        <w:tc>
+          <w:tcPr>
+            <w:shd w:val="clear" w:color="auto" w:fill="F3F4F6"/>
+          </w:tcPr>
+          <w:p>
+            <w:pPr>
+              <w:pStyle w:val="Compact"/>
+              <w:spacing w:after="40"/>
+              <w:jc w:val="left"/>
+            </w:pPr>
+            <w:r>
+              <w:rPr>
+                <w:sz w:val="19"/>
+              </w:rPr>
+              <w:t xml:space="preserve">0.656</w:t>
+            </w:r>
+          </w:p>
+        </w:tc>
+        <w:tc>
+          <w:tcPr>
+            <w:shd w:val="clear" w:color="auto" w:fill="F3F4F6"/>
+          </w:tcPr>
+          <w:p>
+            <w:pPr>
+              <w:pStyle w:val="Compact"/>
+              <w:spacing w:after="40"/>
+              <w:jc w:val="left"/>
+            </w:pPr>
+            <w:r>
+              <w:rPr>
+                <w:sz w:val="19"/>
+              </w:rPr>
+              <w:t xml:space="preserve">0.858</w:t>
+            </w:r>
+          </w:p>
+        </w:tc>
+        <w:tc>
+          <w:tcPr>
+            <w:shd w:val="clear" w:color="auto" w:fill="F3F4F6"/>
+          </w:tcPr>
+          <w:p>
+            <w:pPr>
+              <w:pStyle w:val="Compact"/>
+              <w:spacing w:after="40"/>
+              <w:jc w:val="left"/>
+            </w:pPr>
+            <w:r>
+              <w:rPr>
+                <w:sz w:val="19"/>
+              </w:rPr>
+              <w:t xml:space="preserve">0.701 ± 0.139</w:t>
             </w:r>
           </w:p>
         </w:tc>
@@ -14224,87 +13575,87 @@
               <w:rPr>
                 <w:sz w:val="19"/>
               </w:rPr>
-              <w:t xml:space="preserve">0.298</w:t>
-            </w:r>
-          </w:p>
-        </w:tc>
-        <w:tc>
-          <w:tcPr/>
-          <w:p>
-            <w:pPr>
-              <w:pStyle w:val="Compact"/>
-              <w:spacing w:after="40"/>
-              <w:jc w:val="left"/>
-            </w:pPr>
-            <w:r>
-              <w:rPr>
-                <w:sz w:val="19"/>
-              </w:rPr>
-              <w:t xml:space="preserve">0.287</w:t>
-            </w:r>
-          </w:p>
-        </w:tc>
-        <w:tc>
-          <w:tcPr/>
-          <w:p>
-            <w:pPr>
-              <w:pStyle w:val="Compact"/>
-              <w:spacing w:after="40"/>
-              <w:jc w:val="left"/>
-            </w:pPr>
-            <w:r>
-              <w:rPr>
-                <w:sz w:val="19"/>
-              </w:rPr>
-              <w:t xml:space="preserve">0.382</w:t>
-            </w:r>
-          </w:p>
-        </w:tc>
-        <w:tc>
-          <w:tcPr/>
-          <w:p>
-            <w:pPr>
-              <w:pStyle w:val="Compact"/>
-              <w:spacing w:after="40"/>
-              <w:jc w:val="left"/>
-            </w:pPr>
-            <w:r>
-              <w:rPr>
-                <w:sz w:val="19"/>
-              </w:rPr>
-              <w:t xml:space="preserve">0.281</w:t>
-            </w:r>
-          </w:p>
-        </w:tc>
-        <w:tc>
-          <w:tcPr/>
-          <w:p>
-            <w:pPr>
-              <w:pStyle w:val="Compact"/>
-              <w:spacing w:after="40"/>
-              <w:jc w:val="left"/>
-            </w:pPr>
-            <w:r>
-              <w:rPr>
-                <w:sz w:val="19"/>
-              </w:rPr>
-              <w:t xml:space="preserve">0.297</w:t>
-            </w:r>
-          </w:p>
-        </w:tc>
-        <w:tc>
-          <w:tcPr/>
-          <w:p>
-            <w:pPr>
-              <w:pStyle w:val="Compact"/>
-              <w:spacing w:after="40"/>
-              <w:jc w:val="left"/>
-            </w:pPr>
-            <w:r>
-              <w:rPr>
-                <w:sz w:val="19"/>
-              </w:rPr>
-              <w:t xml:space="preserve">0.309 ± 0.037</w:t>
+              <w:t xml:space="preserve">0.311</w:t>
+            </w:r>
+          </w:p>
+        </w:tc>
+        <w:tc>
+          <w:tcPr/>
+          <w:p>
+            <w:pPr>
+              <w:pStyle w:val="Compact"/>
+              <w:spacing w:after="40"/>
+              <w:jc w:val="left"/>
+            </w:pPr>
+            <w:r>
+              <w:rPr>
+                <w:sz w:val="19"/>
+              </w:rPr>
+              <w:t xml:space="preserve">0.295</w:t>
+            </w:r>
+          </w:p>
+        </w:tc>
+        <w:tc>
+          <w:tcPr/>
+          <w:p>
+            <w:pPr>
+              <w:pStyle w:val="Compact"/>
+              <w:spacing w:after="40"/>
+              <w:jc w:val="left"/>
+            </w:pPr>
+            <w:r>
+              <w:rPr>
+                <w:sz w:val="19"/>
+              </w:rPr>
+              <w:t xml:space="preserve">0.406</w:t>
+            </w:r>
+          </w:p>
+        </w:tc>
+        <w:tc>
+          <w:tcPr/>
+          <w:p>
+            <w:pPr>
+              <w:pStyle w:val="Compact"/>
+              <w:spacing w:after="40"/>
+              <w:jc w:val="left"/>
+            </w:pPr>
+            <w:r>
+              <w:rPr>
+                <w:sz w:val="19"/>
+              </w:rPr>
+              <w:t xml:space="preserve">0.264</w:t>
+            </w:r>
+          </w:p>
+        </w:tc>
+        <w:tc>
+          <w:tcPr/>
+          <w:p>
+            <w:pPr>
+              <w:pStyle w:val="Compact"/>
+              <w:spacing w:after="40"/>
+              <w:jc w:val="left"/>
+            </w:pPr>
+            <w:r>
+              <w:rPr>
+                <w:sz w:val="19"/>
+              </w:rPr>
+              <w:t xml:space="preserve">0.291</w:t>
+            </w:r>
+          </w:p>
+        </w:tc>
+        <w:tc>
+          <w:tcPr/>
+          <w:p>
+            <w:pPr>
+              <w:pStyle w:val="Compact"/>
+              <w:spacing w:after="40"/>
+              <w:jc w:val="left"/>
+            </w:pPr>
+            <w:r>
+              <w:rPr>
+                <w:sz w:val="19"/>
+              </w:rPr>
+              <w:t xml:space="preserve">0.313 ± 0.049</w:t>
             </w:r>
           </w:p>
         </w:tc>
@@ -14342,97 +13693,97 @@
               <w:rPr>
                 <w:sz w:val="19"/>
               </w:rPr>
-              <w:t xml:space="preserve">0.239</w:t>
-            </w:r>
-          </w:p>
-        </w:tc>
-        <w:tc>
-          <w:tcPr>
-            <w:shd w:val="clear" w:color="auto" w:fill="F3F4F6"/>
-          </w:tcPr>
-          <w:p>
-            <w:pPr>
-              <w:pStyle w:val="Compact"/>
-              <w:spacing w:after="40"/>
-              <w:jc w:val="left"/>
-            </w:pPr>
-            <w:r>
-              <w:rPr>
-                <w:sz w:val="19"/>
-              </w:rPr>
-              <w:t xml:space="preserve">0.242</w:t>
-            </w:r>
-          </w:p>
-        </w:tc>
-        <w:tc>
-          <w:tcPr>
-            <w:shd w:val="clear" w:color="auto" w:fill="F3F4F6"/>
-          </w:tcPr>
-          <w:p>
-            <w:pPr>
-              <w:pStyle w:val="Compact"/>
-              <w:spacing w:after="40"/>
-              <w:jc w:val="left"/>
-            </w:pPr>
-            <w:r>
-              <w:rPr>
-                <w:sz w:val="19"/>
-              </w:rPr>
-              <w:t xml:space="preserve">0.357</w:t>
-            </w:r>
-          </w:p>
-        </w:tc>
-        <w:tc>
-          <w:tcPr>
-            <w:shd w:val="clear" w:color="auto" w:fill="F3F4F6"/>
-          </w:tcPr>
-          <w:p>
-            <w:pPr>
-              <w:pStyle w:val="Compact"/>
-              <w:spacing w:after="40"/>
-              <w:jc w:val="left"/>
-            </w:pPr>
-            <w:r>
-              <w:rPr>
-                <w:sz w:val="19"/>
-              </w:rPr>
-              <w:t xml:space="preserve">0.251</w:t>
-            </w:r>
-          </w:p>
-        </w:tc>
-        <w:tc>
-          <w:tcPr>
-            <w:shd w:val="clear" w:color="auto" w:fill="F3F4F6"/>
-          </w:tcPr>
-          <w:p>
-            <w:pPr>
-              <w:pStyle w:val="Compact"/>
-              <w:spacing w:after="40"/>
-              <w:jc w:val="left"/>
-            </w:pPr>
-            <w:r>
-              <w:rPr>
-                <w:sz w:val="19"/>
-              </w:rPr>
-              <w:t xml:space="preserve">0.260</w:t>
-            </w:r>
-          </w:p>
-        </w:tc>
-        <w:tc>
-          <w:tcPr>
-            <w:shd w:val="clear" w:color="auto" w:fill="F3F4F6"/>
-          </w:tcPr>
-          <w:p>
-            <w:pPr>
-              <w:pStyle w:val="Compact"/>
-              <w:spacing w:after="40"/>
-              <w:jc w:val="left"/>
-            </w:pPr>
-            <w:r>
-              <w:rPr>
-                <w:sz w:val="19"/>
-              </w:rPr>
-              <w:t xml:space="preserve">0.270 ± 0.044</w:t>
+              <w:t xml:space="preserve">0.226</w:t>
+            </w:r>
+          </w:p>
+        </w:tc>
+        <w:tc>
+          <w:tcPr>
+            <w:shd w:val="clear" w:color="auto" w:fill="F3F4F6"/>
+          </w:tcPr>
+          <w:p>
+            <w:pPr>
+              <w:pStyle w:val="Compact"/>
+              <w:spacing w:after="40"/>
+              <w:jc w:val="left"/>
+            </w:pPr>
+            <w:r>
+              <w:rPr>
+                <w:sz w:val="19"/>
+              </w:rPr>
+              <w:t xml:space="preserve">0.254</w:t>
+            </w:r>
+          </w:p>
+        </w:tc>
+        <w:tc>
+          <w:tcPr>
+            <w:shd w:val="clear" w:color="auto" w:fill="F3F4F6"/>
+          </w:tcPr>
+          <w:p>
+            <w:pPr>
+              <w:pStyle w:val="Compact"/>
+              <w:spacing w:after="40"/>
+              <w:jc w:val="left"/>
+            </w:pPr>
+            <w:r>
+              <w:rPr>
+                <w:sz w:val="19"/>
+              </w:rPr>
+              <w:t xml:space="preserve">0.408</w:t>
+            </w:r>
+          </w:p>
+        </w:tc>
+        <w:tc>
+          <w:tcPr>
+            <w:shd w:val="clear" w:color="auto" w:fill="F3F4F6"/>
+          </w:tcPr>
+          <w:p>
+            <w:pPr>
+              <w:pStyle w:val="Compact"/>
+              <w:spacing w:after="40"/>
+              <w:jc w:val="left"/>
+            </w:pPr>
+            <w:r>
+              <w:rPr>
+                <w:sz w:val="19"/>
+              </w:rPr>
+              <w:t xml:space="preserve">0.276</w:t>
+            </w:r>
+          </w:p>
+        </w:tc>
+        <w:tc>
+          <w:tcPr>
+            <w:shd w:val="clear" w:color="auto" w:fill="F3F4F6"/>
+          </w:tcPr>
+          <w:p>
+            <w:pPr>
+              <w:pStyle w:val="Compact"/>
+              <w:spacing w:after="40"/>
+              <w:jc w:val="left"/>
+            </w:pPr>
+            <w:r>
+              <w:rPr>
+                <w:sz w:val="19"/>
+              </w:rPr>
+              <w:t xml:space="preserve">0.227</w:t>
+            </w:r>
+          </w:p>
+        </w:tc>
+        <w:tc>
+          <w:tcPr>
+            <w:shd w:val="clear" w:color="auto" w:fill="F3F4F6"/>
+          </w:tcPr>
+          <w:p>
+            <w:pPr>
+              <w:pStyle w:val="Compact"/>
+              <w:spacing w:after="40"/>
+              <w:jc w:val="left"/>
+            </w:pPr>
+            <w:r>
+              <w:rPr>
+                <w:sz w:val="19"/>
+              </w:rPr>
+              <w:t xml:space="preserve">0.278 ± 0.068</w:t>
             </w:r>
           </w:p>
         </w:tc>
@@ -15183,7 +14534,7 @@
               <w:rPr>
                 <w:sz w:val="19"/>
               </w:rPr>
-              <w:t xml:space="preserve">0.667</w:t>
+              <w:t xml:space="preserve">0.661</w:t>
             </w:r>
           </w:p>
         </w:tc>
@@ -15253,7 +14604,7 @@
               <w:rPr>
                 <w:sz w:val="19"/>
               </w:rPr>
-              <w:t xml:space="preserve">0.525</w:t>
+              <w:t xml:space="preserve">0.503</w:t>
             </w:r>
           </w:p>
         </w:tc>
@@ -15323,7 +14674,7 @@
               <w:rPr>
                 <w:sz w:val="19"/>
               </w:rPr>
-              <w:t xml:space="preserve">0.961</w:t>
+              <w:t xml:space="preserve">0.965</w:t>
             </w:r>
           </w:p>
         </w:tc>
@@ -16151,11 +15502,6 @@
           <w:sz w:val="17"/>
         </w:rPr>
         <w:br/>
-      </w:r>
-      <w:r>
-        <w:rPr>
-          <w:sz w:val="17"/>
-        </w:rPr>
         <w:br/>
       </w:r>
       <w:r>
@@ -16279,11 +15625,6 @@
           <w:sz w:val="17"/>
         </w:rPr>
         <w:br/>
-      </w:r>
-      <w:r>
-        <w:rPr>
-          <w:sz w:val="17"/>
-        </w:rPr>
         <w:br/>
       </w:r>
       <w:r>
@@ -16462,11 +15803,6 @@
           <w:sz w:val="17"/>
         </w:rPr>
         <w:br/>
-      </w:r>
-      <w:r>
-        <w:rPr>
-          <w:sz w:val="17"/>
-        </w:rPr>
         <w:br/>
       </w:r>
       <w:r>
@@ -16776,11 +16112,6 @@
           <w:sz w:val="17"/>
         </w:rPr>
         <w:br/>
-      </w:r>
-      <w:r>
-        <w:rPr>
-          <w:sz w:val="17"/>
-        </w:rPr>
         <w:br/>
       </w:r>
       <w:r>
@@ -16841,13 +16172,33 @@
           <w:rStyle w:val="ExtensionTok"/>
           <w:sz w:val="17"/>
         </w:rPr>
-        <w:t xml:space="preserve">pytest</w:t>
+        <w:t xml:space="preserve">python</w:t>
       </w:r>
       <w:r>
         <w:rPr>
           <w:rStyle w:val="NormalTok"/>
           <w:sz w:val="17"/>
         </w:rPr>
+        <w:t xml:space="preserve"> make_report_figures.py</w:t>
+      </w:r>
+      <w:r>
+        <w:rPr>
+          <w:sz w:val="17"/>
+        </w:rPr>
+        <w:br/>
+      </w:r>
+      <w:r>
+        <w:rPr>
+          <w:rStyle w:val="ExtensionTok"/>
+          <w:sz w:val="17"/>
+        </w:rPr>
+        <w:t xml:space="preserve">pytest</w:t>
+      </w:r>
+      <w:r>
+        <w:rPr>
+          <w:rStyle w:val="NormalTok"/>
+          <w:sz w:val="17"/>
+        </w:rPr>
         <w:t xml:space="preserve"> tests/ </w:t>
       </w:r>
       <w:r>
@@ -16864,10 +16215,7 @@
         <w:jc w:val="left"/>
       </w:pPr>
       <w:r>
-        <w:t xml:space="preserve">Every run writes</w:t>
-      </w:r>
-      <w:r>
-        <w:t xml:space="preserve"> </w:t>
+        <w:t xml:space="preserve">Every run writes </w:t>
       </w:r>
       <w:r>
         <w:rPr>
@@ -16876,10 +16224,7 @@
         <w:t xml:space="preserve">&lt;tag&gt;_metrics.json</w:t>
       </w:r>
       <w:r>
-        <w:t xml:space="preserve">,</w:t>
-      </w:r>
-      <w:r>
-        <w:t xml:space="preserve"> </w:t>
+        <w:t xml:space="preserve">, </w:t>
       </w:r>
       <w:r>
         <w:rPr>
@@ -16888,10 +16233,7 @@
         <w:t xml:space="preserve">&lt;tag&gt;_predictions.npz</w:t>
       </w:r>
       <w:r>
-        <w:t xml:space="preserve">,</w:t>
-      </w:r>
-      <w:r>
-        <w:t xml:space="preserve"> </w:t>
+        <w:t xml:space="preserve">, </w:t>
       </w:r>
       <w:r>
         <w:rPr>
@@ -16900,13 +16242,7 @@
         <w:t xml:space="preserve">&lt;tag&gt;_best_params.npy</w:t>
       </w:r>
       <w:r>
-        <w:t xml:space="preserve"> </w:t>
-      </w:r>
-      <w:r>
-        <w:t xml:space="preserve">and</w:t>
-      </w:r>
-      <w:r>
-        <w:t xml:space="preserve"> </w:t>
+        <w:t xml:space="preserve"> and </w:t>
       </w:r>
       <w:r>
         <w:rPr>
@@ -16915,13 +16251,7 @@
         <w:t xml:space="preserve">&lt;tag&gt;_curves.npz</w:t>
       </w:r>
       <w:r>
-        <w:t xml:space="preserve"> </w:t>
-      </w:r>
-      <w:r>
-        <w:t xml:space="preserve">to</w:t>
-      </w:r>
-      <w:r>
-        <w:t xml:space="preserve"> </w:t>
+        <w:t xml:space="preserve"> to </w:t>
       </w:r>
       <w:r>
         <w:rPr>

</xml_diff>